<commit_message>
add comments Beverly based on cross-validation
</commit_message>
<xml_diff>
--- a/docx/post-hoc/post-hoc-table.docx
+++ b/docx/post-hoc/post-hoc-table.docx
@@ -17,7 +17,7 @@
         <w:ind w:left="60" w:right="60" w:firstLine="0" w:firstLineChars="0"/>
       </w:pPr>
       <w:r>
-        <w:t xml:space="preserve">Dunn Test for pairwise comparisons of Chloride Methods</w:t>
+        <w:t xml:space="preserve">Paired Wilcoxon post hoc comparisons of chloride methods</w:t>
       </w:r>
     </w:p>
     <w:tbl xmlns:a="http://schemas.openxmlformats.org/drawingml/2006/main" xmlns:pic="http://schemas.openxmlformats.org/drawingml/2006/picture">
@@ -27,12 +27,12 @@
         <w:tblLook w:firstRow="1" w:lastRow="0" w:firstColumn="0" w:lastColumn="0" w:noHBand="0" w:noVBand="1"/>
       </w:tblPr>
       <w:tblGrid>
-        <w:gridCol w:w="1296"/>
-        <w:gridCol w:w="1296"/>
-        <w:gridCol w:w="1296"/>
-        <w:gridCol w:w="1296"/>
-        <w:gridCol w:w="1296"/>
-        <w:gridCol w:w="1296"/>
+        <w:gridCol w:w="1267"/>
+        <w:gridCol w:w="1267"/>
+        <w:gridCol w:w="1084"/>
+        <w:gridCol w:w="1169"/>
+        <w:gridCol w:w="2319"/>
+        <w:gridCol w:w="1316"/>
       </w:tblGrid>
       <w:tr>
         <w:trPr>
@@ -80,7 +80,7 @@
                 <w:szCs w:val="18"/>
                 <w:color w:val="000000"/>
               </w:rPr>
-              <w:t xml:space="preserve">Comparison</w:t>
+              <w:t xml:space="preserve">Method1</w:t>
             </w:r>
           </w:p>
         </w:tc>
@@ -124,7 +124,7 @@
                 <w:szCs w:val="18"/>
                 <w:color w:val="000000"/>
               </w:rPr>
-              <w:t xml:space="preserve">Z</w:t>
+              <w:t xml:space="preserve">Method2</w:t>
             </w:r>
           </w:p>
         </w:tc>
@@ -168,7 +168,7 @@
                 <w:szCs w:val="18"/>
                 <w:color w:val="000000"/>
               </w:rPr>
-              <w:t xml:space="preserve">P.unadj</w:t>
+              <w:t xml:space="preserve">P.adj</w:t>
             </w:r>
           </w:p>
         </w:tc>
@@ -212,7 +212,7 @@
                 <w:szCs w:val="18"/>
                 <w:color w:val="000000"/>
               </w:rPr>
-              <w:t xml:space="preserve">P.adj</w:t>
+              <w:t xml:space="preserve">Scale</w:t>
             </w:r>
           </w:p>
         </w:tc>
@@ -307,7 +307,7 @@
       </w:tr>
       <w:tr>
         <w:trPr>
-          <w:trHeight w:val="615" w:hRule="auto"/>
+          <w:trHeight w:val="621" w:hRule="auto"/>
         </w:trPr>
         body 1
         <w:tc>
@@ -350,7 +350,7 @@
                 <w:szCs w:val="18"/>
                 <w:color w:val="000000"/>
               </w:rPr>
-              <w:t xml:space="preserve">IC - ICP</w:t>
+              <w:t xml:space="preserve">ICP</w:t>
             </w:r>
           </w:p>
         </w:tc>
@@ -394,7 +394,7 @@
                 <w:szCs w:val="18"/>
                 <w:color w:val="000000"/>
               </w:rPr>
-              <w:t xml:space="preserve">0.29</w:t>
+              <w:t xml:space="preserve">IC</w:t>
             </w:r>
           </w:p>
         </w:tc>
@@ -438,7 +438,7 @@
                 <w:szCs w:val="18"/>
                 <w:color w:val="000000"/>
               </w:rPr>
-              <w:t xml:space="preserve">0.7715904457364</w:t>
+              <w:t xml:space="preserve">1.0000</w:t>
             </w:r>
           </w:p>
         </w:tc>
@@ -482,7 +482,7 @@
                 <w:szCs w:val="18"/>
                 <w:color w:val="000000"/>
               </w:rPr>
-              <w:t xml:space="preserve">1.0000</w:t>
+              <w:t xml:space="preserve">Original</w:t>
             </w:r>
           </w:p>
         </w:tc>
@@ -577,7 +577,7 @@
       </w:tr>
       <w:tr>
         <w:trPr>
-          <w:trHeight w:val="615" w:hRule="auto"/>
+          <w:trHeight w:val="621" w:hRule="auto"/>
         </w:trPr>
         body 2
         <w:tc>
@@ -620,139 +620,139 @@
                 <w:szCs w:val="18"/>
                 <w:color w:val="000000"/>
               </w:rPr>
-              <w:t xml:space="preserve">IC - MT</w:t>
-            </w:r>
-          </w:p>
-        </w:tc>
-        <w:tc>
-          <w:tcPr>
-            <w:tcBorders>
-              <w:bottom w:val="none" w:sz="0" w:space="0" w:color="000000"/>
-              <w:top w:val="none" w:sz="0" w:space="0" w:color="000000"/>
-              <w:left w:val="none" w:sz="0" w:space="0" w:color="000000"/>
-              <w:right w:val="none" w:sz="0" w:space="0" w:color="000000"/>
-            </w:tcBorders>
-            <w:shd w:val="clear" w:color="auto" w:fill="FFFFFF"/>
-            <w:tcMar>
-              <w:top w:w="0" w:type="dxa"/>
-              <w:bottom w:w="0" w:type="dxa"/>
-              <w:left w:w="0" w:type="dxa"/>
-              <w:right w:w="0" w:type="dxa"/>
-            </w:tcMar>
-            <w:vAlign w:val="center"/>
-          </w:tcPr>
-          <w:p>
-            <w:pPr>
-              <w:pStyle w:val="Normal"/>
-              <w:jc w:val="center"/>
-              <w:pBdr>
-                <w:bottom w:val="none" w:sz="0" w:space="0" w:color="000000"/>
-                <w:top w:val="none" w:sz="0" w:space="0" w:color="000000"/>
-                <w:left w:val="none" w:sz="0" w:space="0" w:color="000000"/>
-                <w:right w:val="none" w:sz="0" w:space="0" w:color="000000"/>
-              </w:pBdr>
-              <w:spacing w:after="40" w:before="40" w:line="240"/>
-              <w:ind w:left="40" w:right="40" w:firstLine="0" w:firstLineChars="0"/>
-            </w:pPr>
-            <w:r>
-              <w:rPr>
-                <w:rFonts w:ascii="Helvetica" w:hAnsi="Helvetica" w:eastAsia="Helvetica" w:cs="Helvetica"/>
-                <w:i w:val="false"/>
-                <w:b w:val="false"/>
-                <w:u w:val="none"/>
-                <w:sz w:val="18"/>
-                <w:szCs w:val="18"/>
-                <w:color w:val="000000"/>
-              </w:rPr>
-              <w:t xml:space="preserve">-0.86</w:t>
-            </w:r>
-          </w:p>
-        </w:tc>
-        <w:tc>
-          <w:tcPr>
-            <w:tcBorders>
-              <w:bottom w:val="none" w:sz="0" w:space="0" w:color="000000"/>
-              <w:top w:val="none" w:sz="0" w:space="0" w:color="000000"/>
-              <w:left w:val="none" w:sz="0" w:space="0" w:color="000000"/>
-              <w:right w:val="none" w:sz="0" w:space="0" w:color="000000"/>
-            </w:tcBorders>
-            <w:shd w:val="clear" w:color="auto" w:fill="FFFFFF"/>
-            <w:tcMar>
-              <w:top w:w="0" w:type="dxa"/>
-              <w:bottom w:w="0" w:type="dxa"/>
-              <w:left w:w="0" w:type="dxa"/>
-              <w:right w:w="0" w:type="dxa"/>
-            </w:tcMar>
-            <w:vAlign w:val="center"/>
-          </w:tcPr>
-          <w:p>
-            <w:pPr>
-              <w:pStyle w:val="Normal"/>
-              <w:jc w:val="center"/>
-              <w:pBdr>
-                <w:bottom w:val="none" w:sz="0" w:space="0" w:color="000000"/>
-                <w:top w:val="none" w:sz="0" w:space="0" w:color="000000"/>
-                <w:left w:val="none" w:sz="0" w:space="0" w:color="000000"/>
-                <w:right w:val="none" w:sz="0" w:space="0" w:color="000000"/>
-              </w:pBdr>
-              <w:spacing w:after="40" w:before="40" w:line="240"/>
-              <w:ind w:left="40" w:right="40" w:firstLine="0" w:firstLineChars="0"/>
-            </w:pPr>
-            <w:r>
-              <w:rPr>
-                <w:rFonts w:ascii="Helvetica" w:hAnsi="Helvetica" w:eastAsia="Helvetica" w:cs="Helvetica"/>
-                <w:i w:val="false"/>
-                <w:b w:val="false"/>
-                <w:u w:val="none"/>
-                <w:sz w:val="18"/>
-                <w:szCs w:val="18"/>
-                <w:color w:val="000000"/>
-              </w:rPr>
-              <w:t xml:space="preserve">0.3922826003859</w:t>
-            </w:r>
-          </w:p>
-        </w:tc>
-        <w:tc>
-          <w:tcPr>
-            <w:tcBorders>
-              <w:bottom w:val="none" w:sz="0" w:space="0" w:color="000000"/>
-              <w:top w:val="none" w:sz="0" w:space="0" w:color="000000"/>
-              <w:left w:val="none" w:sz="0" w:space="0" w:color="000000"/>
-              <w:right w:val="none" w:sz="0" w:space="0" w:color="000000"/>
-            </w:tcBorders>
-            <w:shd w:val="clear" w:color="auto" w:fill="FFFFFF"/>
-            <w:tcMar>
-              <w:top w:w="0" w:type="dxa"/>
-              <w:bottom w:w="0" w:type="dxa"/>
-              <w:left w:w="0" w:type="dxa"/>
-              <w:right w:w="0" w:type="dxa"/>
-            </w:tcMar>
-            <w:vAlign w:val="center"/>
-          </w:tcPr>
-          <w:p>
-            <w:pPr>
-              <w:pStyle w:val="Normal"/>
-              <w:jc w:val="center"/>
-              <w:pBdr>
-                <w:bottom w:val="none" w:sz="0" w:space="0" w:color="000000"/>
-                <w:top w:val="none" w:sz="0" w:space="0" w:color="000000"/>
-                <w:left w:val="none" w:sz="0" w:space="0" w:color="000000"/>
-                <w:right w:val="none" w:sz="0" w:space="0" w:color="000000"/>
-              </w:pBdr>
-              <w:spacing w:after="40" w:before="40" w:line="240"/>
-              <w:ind w:left="40" w:right="40" w:firstLine="0" w:firstLineChars="0"/>
-            </w:pPr>
-            <w:r>
-              <w:rPr>
-                <w:rFonts w:ascii="Helvetica" w:hAnsi="Helvetica" w:eastAsia="Helvetica" w:cs="Helvetica"/>
-                <w:i w:val="false"/>
-                <w:b w:val="false"/>
-                <w:u w:val="none"/>
-                <w:sz w:val="18"/>
-                <w:szCs w:val="18"/>
-                <w:color w:val="000000"/>
-              </w:rPr>
-              <w:t xml:space="preserve">1.0000</w:t>
+              <w:t xml:space="preserve">MT</w:t>
+            </w:r>
+          </w:p>
+        </w:tc>
+        <w:tc>
+          <w:tcPr>
+            <w:tcBorders>
+              <w:bottom w:val="none" w:sz="0" w:space="0" w:color="000000"/>
+              <w:top w:val="none" w:sz="0" w:space="0" w:color="000000"/>
+              <w:left w:val="none" w:sz="0" w:space="0" w:color="000000"/>
+              <w:right w:val="none" w:sz="0" w:space="0" w:color="000000"/>
+            </w:tcBorders>
+            <w:shd w:val="clear" w:color="auto" w:fill="FFFFFF"/>
+            <w:tcMar>
+              <w:top w:w="0" w:type="dxa"/>
+              <w:bottom w:w="0" w:type="dxa"/>
+              <w:left w:w="0" w:type="dxa"/>
+              <w:right w:w="0" w:type="dxa"/>
+            </w:tcMar>
+            <w:vAlign w:val="center"/>
+          </w:tcPr>
+          <w:p>
+            <w:pPr>
+              <w:pStyle w:val="Normal"/>
+              <w:jc w:val="center"/>
+              <w:pBdr>
+                <w:bottom w:val="none" w:sz="0" w:space="0" w:color="000000"/>
+                <w:top w:val="none" w:sz="0" w:space="0" w:color="000000"/>
+                <w:left w:val="none" w:sz="0" w:space="0" w:color="000000"/>
+                <w:right w:val="none" w:sz="0" w:space="0" w:color="000000"/>
+              </w:pBdr>
+              <w:spacing w:after="40" w:before="40" w:line="240"/>
+              <w:ind w:left="40" w:right="40" w:firstLine="0" w:firstLineChars="0"/>
+            </w:pPr>
+            <w:r>
+              <w:rPr>
+                <w:rFonts w:ascii="Helvetica" w:hAnsi="Helvetica" w:eastAsia="Helvetica" w:cs="Helvetica"/>
+                <w:i w:val="false"/>
+                <w:b w:val="false"/>
+                <w:u w:val="none"/>
+                <w:sz w:val="18"/>
+                <w:szCs w:val="18"/>
+                <w:color w:val="000000"/>
+              </w:rPr>
+              <w:t xml:space="preserve">IC</w:t>
+            </w:r>
+          </w:p>
+        </w:tc>
+        <w:tc>
+          <w:tcPr>
+            <w:tcBorders>
+              <w:bottom w:val="none" w:sz="0" w:space="0" w:color="000000"/>
+              <w:top w:val="none" w:sz="0" w:space="0" w:color="000000"/>
+              <w:left w:val="none" w:sz="0" w:space="0" w:color="000000"/>
+              <w:right w:val="none" w:sz="0" w:space="0" w:color="000000"/>
+            </w:tcBorders>
+            <w:shd w:val="clear" w:color="auto" w:fill="FFFFFF"/>
+            <w:tcMar>
+              <w:top w:w="0" w:type="dxa"/>
+              <w:bottom w:w="0" w:type="dxa"/>
+              <w:left w:w="0" w:type="dxa"/>
+              <w:right w:w="0" w:type="dxa"/>
+            </w:tcMar>
+            <w:vAlign w:val="center"/>
+          </w:tcPr>
+          <w:p>
+            <w:pPr>
+              <w:pStyle w:val="Normal"/>
+              <w:jc w:val="center"/>
+              <w:pBdr>
+                <w:bottom w:val="none" w:sz="0" w:space="0" w:color="000000"/>
+                <w:top w:val="none" w:sz="0" w:space="0" w:color="000000"/>
+                <w:left w:val="none" w:sz="0" w:space="0" w:color="000000"/>
+                <w:right w:val="none" w:sz="0" w:space="0" w:color="000000"/>
+              </w:pBdr>
+              <w:spacing w:after="40" w:before="40" w:line="240"/>
+              <w:ind w:left="40" w:right="40" w:firstLine="0" w:firstLineChars="0"/>
+            </w:pPr>
+            <w:r>
+              <w:rPr>
+                <w:rFonts w:ascii="Helvetica" w:hAnsi="Helvetica" w:eastAsia="Helvetica" w:cs="Helvetica"/>
+                <w:i w:val="false"/>
+                <w:b w:val="false"/>
+                <w:u w:val="none"/>
+                <w:sz w:val="18"/>
+                <w:szCs w:val="18"/>
+                <w:color w:val="000000"/>
+              </w:rPr>
+              <w:t xml:space="preserve">0.2670</w:t>
+            </w:r>
+          </w:p>
+        </w:tc>
+        <w:tc>
+          <w:tcPr>
+            <w:tcBorders>
+              <w:bottom w:val="none" w:sz="0" w:space="0" w:color="000000"/>
+              <w:top w:val="none" w:sz="0" w:space="0" w:color="000000"/>
+              <w:left w:val="none" w:sz="0" w:space="0" w:color="000000"/>
+              <w:right w:val="none" w:sz="0" w:space="0" w:color="000000"/>
+            </w:tcBorders>
+            <w:shd w:val="clear" w:color="auto" w:fill="FFFFFF"/>
+            <w:tcMar>
+              <w:top w:w="0" w:type="dxa"/>
+              <w:bottom w:w="0" w:type="dxa"/>
+              <w:left w:w="0" w:type="dxa"/>
+              <w:right w:w="0" w:type="dxa"/>
+            </w:tcMar>
+            <w:vAlign w:val="center"/>
+          </w:tcPr>
+          <w:p>
+            <w:pPr>
+              <w:pStyle w:val="Normal"/>
+              <w:jc w:val="center"/>
+              <w:pBdr>
+                <w:bottom w:val="none" w:sz="0" w:space="0" w:color="000000"/>
+                <w:top w:val="none" w:sz="0" w:space="0" w:color="000000"/>
+                <w:left w:val="none" w:sz="0" w:space="0" w:color="000000"/>
+                <w:right w:val="none" w:sz="0" w:space="0" w:color="000000"/>
+              </w:pBdr>
+              <w:spacing w:after="40" w:before="40" w:line="240"/>
+              <w:ind w:left="40" w:right="40" w:firstLine="0" w:firstLineChars="0"/>
+            </w:pPr>
+            <w:r>
+              <w:rPr>
+                <w:rFonts w:ascii="Helvetica" w:hAnsi="Helvetica" w:eastAsia="Helvetica" w:cs="Helvetica"/>
+                <w:i w:val="false"/>
+                <w:b w:val="false"/>
+                <w:u w:val="none"/>
+                <w:sz w:val="18"/>
+                <w:szCs w:val="18"/>
+                <w:color w:val="000000"/>
+              </w:rPr>
+              <w:t xml:space="preserve">Original</w:t>
             </w:r>
           </w:p>
         </w:tc>
@@ -847,7 +847,7 @@
       </w:tr>
       <w:tr>
         <w:trPr>
-          <w:trHeight w:val="615" w:hRule="auto"/>
+          <w:trHeight w:val="621" w:hRule="auto"/>
         </w:trPr>
         body 3
         <w:tc>
@@ -890,227 +890,227 @@
                 <w:szCs w:val="18"/>
                 <w:color w:val="000000"/>
               </w:rPr>
-              <w:t xml:space="preserve">ICP - MT</w:t>
-            </w:r>
-          </w:p>
-        </w:tc>
-        <w:tc>
-          <w:tcPr>
-            <w:tcBorders>
-              <w:bottom w:val="none" w:sz="0" w:space="0" w:color="000000"/>
-              <w:top w:val="none" w:sz="0" w:space="0" w:color="000000"/>
-              <w:left w:val="none" w:sz="0" w:space="0" w:color="000000"/>
-              <w:right w:val="none" w:sz="0" w:space="0" w:color="000000"/>
-            </w:tcBorders>
-            <w:shd w:val="clear" w:color="auto" w:fill="FFFFFF"/>
-            <w:tcMar>
-              <w:top w:w="0" w:type="dxa"/>
-              <w:bottom w:w="0" w:type="dxa"/>
-              <w:left w:w="0" w:type="dxa"/>
-              <w:right w:w="0" w:type="dxa"/>
-            </w:tcMar>
-            <w:vAlign w:val="center"/>
-          </w:tcPr>
-          <w:p>
-            <w:pPr>
-              <w:pStyle w:val="Normal"/>
-              <w:jc w:val="center"/>
-              <w:pBdr>
-                <w:bottom w:val="none" w:sz="0" w:space="0" w:color="000000"/>
-                <w:top w:val="none" w:sz="0" w:space="0" w:color="000000"/>
-                <w:left w:val="none" w:sz="0" w:space="0" w:color="000000"/>
-                <w:right w:val="none" w:sz="0" w:space="0" w:color="000000"/>
-              </w:pBdr>
-              <w:spacing w:after="40" w:before="40" w:line="240"/>
-              <w:ind w:left="40" w:right="40" w:firstLine="0" w:firstLineChars="0"/>
-            </w:pPr>
-            <w:r>
-              <w:rPr>
-                <w:rFonts w:ascii="Helvetica" w:hAnsi="Helvetica" w:eastAsia="Helvetica" w:cs="Helvetica"/>
-                <w:i w:val="false"/>
-                <w:b w:val="false"/>
-                <w:u w:val="none"/>
-                <w:sz w:val="18"/>
-                <w:szCs w:val="18"/>
-                <w:color w:val="000000"/>
-              </w:rPr>
-              <w:t xml:space="preserve">-1.15</w:t>
-            </w:r>
-          </w:p>
-        </w:tc>
-        <w:tc>
-          <w:tcPr>
-            <w:tcBorders>
-              <w:bottom w:val="none" w:sz="0" w:space="0" w:color="000000"/>
-              <w:top w:val="none" w:sz="0" w:space="0" w:color="000000"/>
-              <w:left w:val="none" w:sz="0" w:space="0" w:color="000000"/>
-              <w:right w:val="none" w:sz="0" w:space="0" w:color="000000"/>
-            </w:tcBorders>
-            <w:shd w:val="clear" w:color="auto" w:fill="FFFFFF"/>
-            <w:tcMar>
-              <w:top w:w="0" w:type="dxa"/>
-              <w:bottom w:w="0" w:type="dxa"/>
-              <w:left w:w="0" w:type="dxa"/>
-              <w:right w:w="0" w:type="dxa"/>
-            </w:tcMar>
-            <w:vAlign w:val="center"/>
-          </w:tcPr>
-          <w:p>
-            <w:pPr>
-              <w:pStyle w:val="Normal"/>
-              <w:jc w:val="center"/>
-              <w:pBdr>
-                <w:bottom w:val="none" w:sz="0" w:space="0" w:color="000000"/>
-                <w:top w:val="none" w:sz="0" w:space="0" w:color="000000"/>
-                <w:left w:val="none" w:sz="0" w:space="0" w:color="000000"/>
-                <w:right w:val="none" w:sz="0" w:space="0" w:color="000000"/>
-              </w:pBdr>
-              <w:spacing w:after="40" w:before="40" w:line="240"/>
-              <w:ind w:left="40" w:right="40" w:firstLine="0" w:firstLineChars="0"/>
-            </w:pPr>
-            <w:r>
-              <w:rPr>
-                <w:rFonts w:ascii="Helvetica" w:hAnsi="Helvetica" w:eastAsia="Helvetica" w:cs="Helvetica"/>
-                <w:i w:val="false"/>
-                <w:b w:val="false"/>
-                <w:u w:val="none"/>
-                <w:sz w:val="18"/>
-                <w:szCs w:val="18"/>
-                <w:color w:val="000000"/>
-              </w:rPr>
-              <w:t xml:space="preserve">0.2518860504973</w:t>
-            </w:r>
-          </w:p>
-        </w:tc>
-        <w:tc>
-          <w:tcPr>
-            <w:tcBorders>
-              <w:bottom w:val="none" w:sz="0" w:space="0" w:color="000000"/>
-              <w:top w:val="none" w:sz="0" w:space="0" w:color="000000"/>
-              <w:left w:val="none" w:sz="0" w:space="0" w:color="000000"/>
-              <w:right w:val="none" w:sz="0" w:space="0" w:color="000000"/>
-            </w:tcBorders>
-            <w:shd w:val="clear" w:color="auto" w:fill="FFFFFF"/>
-            <w:tcMar>
-              <w:top w:w="0" w:type="dxa"/>
-              <w:bottom w:w="0" w:type="dxa"/>
-              <w:left w:w="0" w:type="dxa"/>
-              <w:right w:w="0" w:type="dxa"/>
-            </w:tcMar>
-            <w:vAlign w:val="center"/>
-          </w:tcPr>
-          <w:p>
-            <w:pPr>
-              <w:pStyle w:val="Normal"/>
-              <w:jc w:val="center"/>
-              <w:pBdr>
-                <w:bottom w:val="none" w:sz="0" w:space="0" w:color="000000"/>
-                <w:top w:val="none" w:sz="0" w:space="0" w:color="000000"/>
-                <w:left w:val="none" w:sz="0" w:space="0" w:color="000000"/>
-                <w:right w:val="none" w:sz="0" w:space="0" w:color="000000"/>
-              </w:pBdr>
-              <w:spacing w:after="40" w:before="40" w:line="240"/>
-              <w:ind w:left="40" w:right="40" w:firstLine="0" w:firstLineChars="0"/>
-            </w:pPr>
-            <w:r>
-              <w:rPr>
-                <w:rFonts w:ascii="Helvetica" w:hAnsi="Helvetica" w:eastAsia="Helvetica" w:cs="Helvetica"/>
-                <w:i w:val="false"/>
-                <w:b w:val="false"/>
-                <w:u w:val="none"/>
-                <w:sz w:val="18"/>
-                <w:szCs w:val="18"/>
-                <w:color w:val="000000"/>
-              </w:rPr>
-              <w:t xml:space="preserve">1.0000</w:t>
-            </w:r>
-          </w:p>
-        </w:tc>
-        <w:tc>
-          <w:tcPr>
-            <w:tcBorders>
-              <w:bottom w:val="none" w:sz="0" w:space="0" w:color="000000"/>
-              <w:top w:val="none" w:sz="0" w:space="0" w:color="000000"/>
-              <w:left w:val="none" w:sz="0" w:space="0" w:color="000000"/>
-              <w:right w:val="none" w:sz="0" w:space="0" w:color="000000"/>
-            </w:tcBorders>
-            <w:shd w:val="clear" w:color="auto" w:fill="FFFFFF"/>
-            <w:tcMar>
-              <w:top w:w="0" w:type="dxa"/>
-              <w:bottom w:w="0" w:type="dxa"/>
-              <w:left w:w="0" w:type="dxa"/>
-              <w:right w:w="0" w:type="dxa"/>
-            </w:tcMar>
-            <w:vAlign w:val="center"/>
-          </w:tcPr>
-          <w:p>
-            <w:pPr>
-              <w:pStyle w:val="Normal"/>
-              <w:jc w:val="center"/>
-              <w:pBdr>
-                <w:bottom w:val="none" w:sz="0" w:space="0" w:color="000000"/>
-                <w:top w:val="none" w:sz="0" w:space="0" w:color="000000"/>
-                <w:left w:val="none" w:sz="0" w:space="0" w:color="000000"/>
-                <w:right w:val="none" w:sz="0" w:space="0" w:color="000000"/>
-              </w:pBdr>
-              <w:spacing w:after="40" w:before="40" w:line="240"/>
-              <w:ind w:left="40" w:right="40" w:firstLine="0" w:firstLineChars="0"/>
-            </w:pPr>
-            <w:r>
-              <w:rPr>
-                <w:rFonts w:ascii="Helvetica" w:hAnsi="Helvetica" w:eastAsia="Helvetica" w:cs="Helvetica"/>
-                <w:i w:val="false"/>
-                <w:b w:val="false"/>
-                <w:u w:val="none"/>
-                <w:sz w:val="18"/>
-                <w:szCs w:val="18"/>
-                <w:color w:val="000000"/>
-              </w:rPr>
-              <w:t xml:space="preserve">Methods equivalent</w:t>
-            </w:r>
-          </w:p>
-        </w:tc>
-        <w:tc>
-          <w:tcPr>
-            <w:tcBorders>
-              <w:bottom w:val="none" w:sz="0" w:space="0" w:color="000000"/>
-              <w:top w:val="none" w:sz="0" w:space="0" w:color="000000"/>
-              <w:left w:val="none" w:sz="0" w:space="0" w:color="000000"/>
-              <w:right w:val="none" w:sz="0" w:space="0" w:color="000000"/>
-            </w:tcBorders>
-            <w:shd w:val="clear" w:color="auto" w:fill="FFFFFF"/>
-            <w:tcMar>
-              <w:top w:w="0" w:type="dxa"/>
-              <w:bottom w:w="0" w:type="dxa"/>
-              <w:left w:w="0" w:type="dxa"/>
-              <w:right w:w="0" w:type="dxa"/>
-            </w:tcMar>
-            <w:vAlign w:val="center"/>
-          </w:tcPr>
-          <w:p>
-            <w:pPr>
-              <w:pStyle w:val="Normal"/>
-              <w:jc w:val="center"/>
-              <w:pBdr>
-                <w:bottom w:val="none" w:sz="0" w:space="0" w:color="000000"/>
-                <w:top w:val="none" w:sz="0" w:space="0" w:color="000000"/>
-                <w:left w:val="none" w:sz="0" w:space="0" w:color="000000"/>
-                <w:right w:val="none" w:sz="0" w:space="0" w:color="000000"/>
-              </w:pBdr>
-              <w:spacing w:after="40" w:before="40" w:line="240"/>
-              <w:ind w:left="40" w:right="40" w:firstLine="0" w:firstLineChars="0"/>
-            </w:pPr>
-            <w:r>
-              <w:rPr>
-                <w:rFonts w:ascii="Helvetica" w:hAnsi="Helvetica" w:eastAsia="Helvetica" w:cs="Helvetica"/>
-                <w:i w:val="false"/>
-                <w:b w:val="false"/>
-                <w:u w:val="none"/>
-                <w:sz w:val="18"/>
-                <w:szCs w:val="18"/>
-                <w:color w:val="000000"/>
-              </w:rPr>
-              <w:t xml:space="preserve">NS</w:t>
+              <w:t xml:space="preserve">PT</w:t>
+            </w:r>
+          </w:p>
+        </w:tc>
+        <w:tc>
+          <w:tcPr>
+            <w:tcBorders>
+              <w:bottom w:val="none" w:sz="0" w:space="0" w:color="000000"/>
+              <w:top w:val="none" w:sz="0" w:space="0" w:color="000000"/>
+              <w:left w:val="none" w:sz="0" w:space="0" w:color="000000"/>
+              <w:right w:val="none" w:sz="0" w:space="0" w:color="000000"/>
+            </w:tcBorders>
+            <w:shd w:val="clear" w:color="auto" w:fill="FFFFFF"/>
+            <w:tcMar>
+              <w:top w:w="0" w:type="dxa"/>
+              <w:bottom w:w="0" w:type="dxa"/>
+              <w:left w:w="0" w:type="dxa"/>
+              <w:right w:w="0" w:type="dxa"/>
+            </w:tcMar>
+            <w:vAlign w:val="center"/>
+          </w:tcPr>
+          <w:p>
+            <w:pPr>
+              <w:pStyle w:val="Normal"/>
+              <w:jc w:val="center"/>
+              <w:pBdr>
+                <w:bottom w:val="none" w:sz="0" w:space="0" w:color="000000"/>
+                <w:top w:val="none" w:sz="0" w:space="0" w:color="000000"/>
+                <w:left w:val="none" w:sz="0" w:space="0" w:color="000000"/>
+                <w:right w:val="none" w:sz="0" w:space="0" w:color="000000"/>
+              </w:pBdr>
+              <w:spacing w:after="40" w:before="40" w:line="240"/>
+              <w:ind w:left="40" w:right="40" w:firstLine="0" w:firstLineChars="0"/>
+            </w:pPr>
+            <w:r>
+              <w:rPr>
+                <w:rFonts w:ascii="Helvetica" w:hAnsi="Helvetica" w:eastAsia="Helvetica" w:cs="Helvetica"/>
+                <w:i w:val="false"/>
+                <w:b w:val="false"/>
+                <w:u w:val="none"/>
+                <w:sz w:val="18"/>
+                <w:szCs w:val="18"/>
+                <w:color w:val="000000"/>
+              </w:rPr>
+              <w:t xml:space="preserve">IC</w:t>
+            </w:r>
+          </w:p>
+        </w:tc>
+        <w:tc>
+          <w:tcPr>
+            <w:tcBorders>
+              <w:bottom w:val="none" w:sz="0" w:space="0" w:color="000000"/>
+              <w:top w:val="none" w:sz="0" w:space="0" w:color="000000"/>
+              <w:left w:val="none" w:sz="0" w:space="0" w:color="000000"/>
+              <w:right w:val="none" w:sz="0" w:space="0" w:color="000000"/>
+            </w:tcBorders>
+            <w:shd w:val="clear" w:color="auto" w:fill="FFFFFF"/>
+            <w:tcMar>
+              <w:top w:w="0" w:type="dxa"/>
+              <w:bottom w:w="0" w:type="dxa"/>
+              <w:left w:w="0" w:type="dxa"/>
+              <w:right w:w="0" w:type="dxa"/>
+            </w:tcMar>
+            <w:vAlign w:val="center"/>
+          </w:tcPr>
+          <w:p>
+            <w:pPr>
+              <w:pStyle w:val="Normal"/>
+              <w:jc w:val="center"/>
+              <w:pBdr>
+                <w:bottom w:val="none" w:sz="0" w:space="0" w:color="000000"/>
+                <w:top w:val="none" w:sz="0" w:space="0" w:color="000000"/>
+                <w:left w:val="none" w:sz="0" w:space="0" w:color="000000"/>
+                <w:right w:val="none" w:sz="0" w:space="0" w:color="000000"/>
+              </w:pBdr>
+              <w:spacing w:after="40" w:before="40" w:line="240"/>
+              <w:ind w:left="40" w:right="40" w:firstLine="0" w:firstLineChars="0"/>
+            </w:pPr>
+            <w:r>
+              <w:rPr>
+                <w:rFonts w:ascii="Helvetica" w:hAnsi="Helvetica" w:eastAsia="Helvetica" w:cs="Helvetica"/>
+                <w:i w:val="false"/>
+                <w:b w:val="false"/>
+                <w:u w:val="none"/>
+                <w:sz w:val="18"/>
+                <w:szCs w:val="18"/>
+                <w:color w:val="000000"/>
+              </w:rPr>
+              <w:t xml:space="preserve">0.0000</w:t>
+            </w:r>
+          </w:p>
+        </w:tc>
+        <w:tc>
+          <w:tcPr>
+            <w:tcBorders>
+              <w:bottom w:val="none" w:sz="0" w:space="0" w:color="000000"/>
+              <w:top w:val="none" w:sz="0" w:space="0" w:color="000000"/>
+              <w:left w:val="none" w:sz="0" w:space="0" w:color="000000"/>
+              <w:right w:val="none" w:sz="0" w:space="0" w:color="000000"/>
+            </w:tcBorders>
+            <w:shd w:val="clear" w:color="auto" w:fill="FFFFFF"/>
+            <w:tcMar>
+              <w:top w:w="0" w:type="dxa"/>
+              <w:bottom w:w="0" w:type="dxa"/>
+              <w:left w:w="0" w:type="dxa"/>
+              <w:right w:w="0" w:type="dxa"/>
+            </w:tcMar>
+            <w:vAlign w:val="center"/>
+          </w:tcPr>
+          <w:p>
+            <w:pPr>
+              <w:pStyle w:val="Normal"/>
+              <w:jc w:val="center"/>
+              <w:pBdr>
+                <w:bottom w:val="none" w:sz="0" w:space="0" w:color="000000"/>
+                <w:top w:val="none" w:sz="0" w:space="0" w:color="000000"/>
+                <w:left w:val="none" w:sz="0" w:space="0" w:color="000000"/>
+                <w:right w:val="none" w:sz="0" w:space="0" w:color="000000"/>
+              </w:pBdr>
+              <w:spacing w:after="40" w:before="40" w:line="240"/>
+              <w:ind w:left="40" w:right="40" w:firstLine="0" w:firstLineChars="0"/>
+            </w:pPr>
+            <w:r>
+              <w:rPr>
+                <w:rFonts w:ascii="Helvetica" w:hAnsi="Helvetica" w:eastAsia="Helvetica" w:cs="Helvetica"/>
+                <w:i w:val="false"/>
+                <w:b w:val="false"/>
+                <w:u w:val="none"/>
+                <w:sz w:val="18"/>
+                <w:szCs w:val="18"/>
+                <w:color w:val="000000"/>
+              </w:rPr>
+              <w:t xml:space="preserve">Original</w:t>
+            </w:r>
+          </w:p>
+        </w:tc>
+        <w:tc>
+          <w:tcPr>
+            <w:tcBorders>
+              <w:bottom w:val="none" w:sz="0" w:space="0" w:color="000000"/>
+              <w:top w:val="none" w:sz="0" w:space="0" w:color="000000"/>
+              <w:left w:val="none" w:sz="0" w:space="0" w:color="000000"/>
+              <w:right w:val="none" w:sz="0" w:space="0" w:color="000000"/>
+            </w:tcBorders>
+            <w:shd w:val="clear" w:color="auto" w:fill="FFFFFF"/>
+            <w:tcMar>
+              <w:top w:w="0" w:type="dxa"/>
+              <w:bottom w:w="0" w:type="dxa"/>
+              <w:left w:w="0" w:type="dxa"/>
+              <w:right w:w="0" w:type="dxa"/>
+            </w:tcMar>
+            <w:vAlign w:val="center"/>
+          </w:tcPr>
+          <w:p>
+            <w:pPr>
+              <w:pStyle w:val="Normal"/>
+              <w:jc w:val="center"/>
+              <w:pBdr>
+                <w:bottom w:val="none" w:sz="0" w:space="0" w:color="000000"/>
+                <w:top w:val="none" w:sz="0" w:space="0" w:color="000000"/>
+                <w:left w:val="none" w:sz="0" w:space="0" w:color="000000"/>
+                <w:right w:val="none" w:sz="0" w:space="0" w:color="000000"/>
+              </w:pBdr>
+              <w:spacing w:after="40" w:before="40" w:line="240"/>
+              <w:ind w:left="40" w:right="40" w:firstLine="0" w:firstLineChars="0"/>
+            </w:pPr>
+            <w:r>
+              <w:rPr>
+                <w:rFonts w:ascii="Helvetica" w:hAnsi="Helvetica" w:eastAsia="Helvetica" w:cs="Helvetica"/>
+                <w:i w:val="false"/>
+                <w:b w:val="false"/>
+                <w:u w:val="none"/>
+                <w:sz w:val="18"/>
+                <w:szCs w:val="18"/>
+                <w:color w:val="000000"/>
+              </w:rPr>
+              <w:t xml:space="preserve">Signif. different</w:t>
+            </w:r>
+          </w:p>
+        </w:tc>
+        <w:tc>
+          <w:tcPr>
+            <w:tcBorders>
+              <w:bottom w:val="none" w:sz="0" w:space="0" w:color="000000"/>
+              <w:top w:val="none" w:sz="0" w:space="0" w:color="000000"/>
+              <w:left w:val="none" w:sz="0" w:space="0" w:color="000000"/>
+              <w:right w:val="none" w:sz="0" w:space="0" w:color="000000"/>
+            </w:tcBorders>
+            <w:shd w:val="clear" w:color="auto" w:fill="FFFFFF"/>
+            <w:tcMar>
+              <w:top w:w="0" w:type="dxa"/>
+              <w:bottom w:w="0" w:type="dxa"/>
+              <w:left w:w="0" w:type="dxa"/>
+              <w:right w:w="0" w:type="dxa"/>
+            </w:tcMar>
+            <w:vAlign w:val="center"/>
+          </w:tcPr>
+          <w:p>
+            <w:pPr>
+              <w:pStyle w:val="Normal"/>
+              <w:jc w:val="center"/>
+              <w:pBdr>
+                <w:bottom w:val="none" w:sz="0" w:space="0" w:color="000000"/>
+                <w:top w:val="none" w:sz="0" w:space="0" w:color="000000"/>
+                <w:left w:val="none" w:sz="0" w:space="0" w:color="000000"/>
+                <w:right w:val="none" w:sz="0" w:space="0" w:color="000000"/>
+              </w:pBdr>
+              <w:spacing w:after="40" w:before="40" w:line="240"/>
+              <w:ind w:left="40" w:right="40" w:firstLine="0" w:firstLineChars="0"/>
+            </w:pPr>
+            <w:r>
+              <w:rPr>
+                <w:rFonts w:ascii="Helvetica" w:hAnsi="Helvetica" w:eastAsia="Helvetica" w:cs="Helvetica"/>
+                <w:i w:val="false"/>
+                <w:b w:val="false"/>
+                <w:u w:val="none"/>
+                <w:sz w:val="18"/>
+                <w:szCs w:val="18"/>
+                <w:color w:val="000000"/>
+              </w:rPr>
+              <w:t xml:space="preserve">***</w:t>
             </w:r>
           </w:p>
         </w:tc>
@@ -1160,227 +1160,227 @@
                 <w:szCs w:val="18"/>
                 <w:color w:val="000000"/>
               </w:rPr>
-              <w:t xml:space="preserve">IC - PT</w:t>
-            </w:r>
-          </w:p>
-        </w:tc>
-        <w:tc>
-          <w:tcPr>
-            <w:tcBorders>
-              <w:bottom w:val="none" w:sz="0" w:space="0" w:color="000000"/>
-              <w:top w:val="none" w:sz="0" w:space="0" w:color="000000"/>
-              <w:left w:val="none" w:sz="0" w:space="0" w:color="000000"/>
-              <w:right w:val="none" w:sz="0" w:space="0" w:color="000000"/>
-            </w:tcBorders>
-            <w:shd w:val="clear" w:color="auto" w:fill="FFFFFF"/>
-            <w:tcMar>
-              <w:top w:w="0" w:type="dxa"/>
-              <w:bottom w:w="0" w:type="dxa"/>
-              <w:left w:w="0" w:type="dxa"/>
-              <w:right w:w="0" w:type="dxa"/>
-            </w:tcMar>
-            <w:vAlign w:val="center"/>
-          </w:tcPr>
-          <w:p>
-            <w:pPr>
-              <w:pStyle w:val="Normal"/>
-              <w:jc w:val="center"/>
-              <w:pBdr>
-                <w:bottom w:val="none" w:sz="0" w:space="0" w:color="000000"/>
-                <w:top w:val="none" w:sz="0" w:space="0" w:color="000000"/>
-                <w:left w:val="none" w:sz="0" w:space="0" w:color="000000"/>
-                <w:right w:val="none" w:sz="0" w:space="0" w:color="000000"/>
-              </w:pBdr>
-              <w:spacing w:after="40" w:before="40" w:line="240"/>
-              <w:ind w:left="40" w:right="40" w:firstLine="0" w:firstLineChars="0"/>
-            </w:pPr>
-            <w:r>
-              <w:rPr>
-                <w:rFonts w:ascii="Helvetica" w:hAnsi="Helvetica" w:eastAsia="Helvetica" w:cs="Helvetica"/>
-                <w:i w:val="false"/>
-                <w:b w:val="false"/>
-                <w:u w:val="none"/>
-                <w:sz w:val="18"/>
-                <w:szCs w:val="18"/>
-                <w:color w:val="000000"/>
-              </w:rPr>
-              <w:t xml:space="preserve">-4.63</w:t>
-            </w:r>
-          </w:p>
-        </w:tc>
-        <w:tc>
-          <w:tcPr>
-            <w:tcBorders>
-              <w:bottom w:val="none" w:sz="0" w:space="0" w:color="000000"/>
-              <w:top w:val="none" w:sz="0" w:space="0" w:color="000000"/>
-              <w:left w:val="none" w:sz="0" w:space="0" w:color="000000"/>
-              <w:right w:val="none" w:sz="0" w:space="0" w:color="000000"/>
-            </w:tcBorders>
-            <w:shd w:val="clear" w:color="auto" w:fill="FFFFFF"/>
-            <w:tcMar>
-              <w:top w:w="0" w:type="dxa"/>
-              <w:bottom w:w="0" w:type="dxa"/>
-              <w:left w:w="0" w:type="dxa"/>
-              <w:right w:w="0" w:type="dxa"/>
-            </w:tcMar>
-            <w:vAlign w:val="center"/>
-          </w:tcPr>
-          <w:p>
-            <w:pPr>
-              <w:pStyle w:val="Normal"/>
-              <w:jc w:val="center"/>
-              <w:pBdr>
-                <w:bottom w:val="none" w:sz="0" w:space="0" w:color="000000"/>
-                <w:top w:val="none" w:sz="0" w:space="0" w:color="000000"/>
-                <w:left w:val="none" w:sz="0" w:space="0" w:color="000000"/>
-                <w:right w:val="none" w:sz="0" w:space="0" w:color="000000"/>
-              </w:pBdr>
-              <w:spacing w:after="40" w:before="40" w:line="240"/>
-              <w:ind w:left="40" w:right="40" w:firstLine="0" w:firstLineChars="0"/>
-            </w:pPr>
-            <w:r>
-              <w:rPr>
-                <w:rFonts w:ascii="Helvetica" w:hAnsi="Helvetica" w:eastAsia="Helvetica" w:cs="Helvetica"/>
-                <w:i w:val="false"/>
-                <w:b w:val="false"/>
-                <w:u w:val="none"/>
-                <w:sz w:val="18"/>
-                <w:szCs w:val="18"/>
-                <w:color w:val="000000"/>
-              </w:rPr>
-              <w:t xml:space="preserve">0.0000036960247</w:t>
-            </w:r>
-          </w:p>
-        </w:tc>
-        <w:tc>
-          <w:tcPr>
-            <w:tcBorders>
-              <w:bottom w:val="none" w:sz="0" w:space="0" w:color="000000"/>
-              <w:top w:val="none" w:sz="0" w:space="0" w:color="000000"/>
-              <w:left w:val="none" w:sz="0" w:space="0" w:color="000000"/>
-              <w:right w:val="none" w:sz="0" w:space="0" w:color="000000"/>
-            </w:tcBorders>
-            <w:shd w:val="clear" w:color="auto" w:fill="FFFFFF"/>
-            <w:tcMar>
-              <w:top w:w="0" w:type="dxa"/>
-              <w:bottom w:w="0" w:type="dxa"/>
-              <w:left w:w="0" w:type="dxa"/>
-              <w:right w:w="0" w:type="dxa"/>
-            </w:tcMar>
-            <w:vAlign w:val="center"/>
-          </w:tcPr>
-          <w:p>
-            <w:pPr>
-              <w:pStyle w:val="Normal"/>
-              <w:jc w:val="center"/>
-              <w:pBdr>
-                <w:bottom w:val="none" w:sz="0" w:space="0" w:color="000000"/>
-                <w:top w:val="none" w:sz="0" w:space="0" w:color="000000"/>
-                <w:left w:val="none" w:sz="0" w:space="0" w:color="000000"/>
-                <w:right w:val="none" w:sz="0" w:space="0" w:color="000000"/>
-              </w:pBdr>
-              <w:spacing w:after="40" w:before="40" w:line="240"/>
-              <w:ind w:left="40" w:right="40" w:firstLine="0" w:firstLineChars="0"/>
-            </w:pPr>
-            <w:r>
-              <w:rPr>
-                <w:rFonts w:ascii="Helvetica" w:hAnsi="Helvetica" w:eastAsia="Helvetica" w:cs="Helvetica"/>
-                <w:i w:val="false"/>
-                <w:b w:val="false"/>
-                <w:u w:val="none"/>
-                <w:sz w:val="18"/>
-                <w:szCs w:val="18"/>
-                <w:color w:val="000000"/>
-              </w:rPr>
-              <w:t xml:space="preserve">0.0000</w:t>
-            </w:r>
-          </w:p>
-        </w:tc>
-        <w:tc>
-          <w:tcPr>
-            <w:tcBorders>
-              <w:bottom w:val="none" w:sz="0" w:space="0" w:color="000000"/>
-              <w:top w:val="none" w:sz="0" w:space="0" w:color="000000"/>
-              <w:left w:val="none" w:sz="0" w:space="0" w:color="000000"/>
-              <w:right w:val="none" w:sz="0" w:space="0" w:color="000000"/>
-            </w:tcBorders>
-            <w:shd w:val="clear" w:color="auto" w:fill="FFFFFF"/>
-            <w:tcMar>
-              <w:top w:w="0" w:type="dxa"/>
-              <w:bottom w:w="0" w:type="dxa"/>
-              <w:left w:w="0" w:type="dxa"/>
-              <w:right w:w="0" w:type="dxa"/>
-            </w:tcMar>
-            <w:vAlign w:val="center"/>
-          </w:tcPr>
-          <w:p>
-            <w:pPr>
-              <w:pStyle w:val="Normal"/>
-              <w:jc w:val="center"/>
-              <w:pBdr>
-                <w:bottom w:val="none" w:sz="0" w:space="0" w:color="000000"/>
-                <w:top w:val="none" w:sz="0" w:space="0" w:color="000000"/>
-                <w:left w:val="none" w:sz="0" w:space="0" w:color="000000"/>
-                <w:right w:val="none" w:sz="0" w:space="0" w:color="000000"/>
-              </w:pBdr>
-              <w:spacing w:after="40" w:before="40" w:line="240"/>
-              <w:ind w:left="40" w:right="40" w:firstLine="0" w:firstLineChars="0"/>
-            </w:pPr>
-            <w:r>
-              <w:rPr>
-                <w:rFonts w:ascii="Helvetica" w:hAnsi="Helvetica" w:eastAsia="Helvetica" w:cs="Helvetica"/>
-                <w:i w:val="false"/>
-                <w:b w:val="false"/>
-                <w:u w:val="none"/>
-                <w:sz w:val="18"/>
-                <w:szCs w:val="18"/>
-                <w:color w:val="000000"/>
-              </w:rPr>
-              <w:t xml:space="preserve">Signif. different</w:t>
-            </w:r>
-          </w:p>
-        </w:tc>
-        <w:tc>
-          <w:tcPr>
-            <w:tcBorders>
-              <w:bottom w:val="none" w:sz="0" w:space="0" w:color="000000"/>
-              <w:top w:val="none" w:sz="0" w:space="0" w:color="000000"/>
-              <w:left w:val="none" w:sz="0" w:space="0" w:color="000000"/>
-              <w:right w:val="none" w:sz="0" w:space="0" w:color="000000"/>
-            </w:tcBorders>
-            <w:shd w:val="clear" w:color="auto" w:fill="FFFFFF"/>
-            <w:tcMar>
-              <w:top w:w="0" w:type="dxa"/>
-              <w:bottom w:w="0" w:type="dxa"/>
-              <w:left w:w="0" w:type="dxa"/>
-              <w:right w:w="0" w:type="dxa"/>
-            </w:tcMar>
-            <w:vAlign w:val="center"/>
-          </w:tcPr>
-          <w:p>
-            <w:pPr>
-              <w:pStyle w:val="Normal"/>
-              <w:jc w:val="center"/>
-              <w:pBdr>
-                <w:bottom w:val="none" w:sz="0" w:space="0" w:color="000000"/>
-                <w:top w:val="none" w:sz="0" w:space="0" w:color="000000"/>
-                <w:left w:val="none" w:sz="0" w:space="0" w:color="000000"/>
-                <w:right w:val="none" w:sz="0" w:space="0" w:color="000000"/>
-              </w:pBdr>
-              <w:spacing w:after="40" w:before="40" w:line="240"/>
-              <w:ind w:left="40" w:right="40" w:firstLine="0" w:firstLineChars="0"/>
-            </w:pPr>
-            <w:r>
-              <w:rPr>
-                <w:rFonts w:ascii="Helvetica" w:hAnsi="Helvetica" w:eastAsia="Helvetica" w:cs="Helvetica"/>
-                <w:i w:val="false"/>
-                <w:b w:val="false"/>
-                <w:u w:val="none"/>
-                <w:sz w:val="18"/>
-                <w:szCs w:val="18"/>
-                <w:color w:val="000000"/>
-              </w:rPr>
-              <w:t xml:space="preserve">***</w:t>
+              <w:t xml:space="preserve">MT</w:t>
+            </w:r>
+          </w:p>
+        </w:tc>
+        <w:tc>
+          <w:tcPr>
+            <w:tcBorders>
+              <w:bottom w:val="none" w:sz="0" w:space="0" w:color="000000"/>
+              <w:top w:val="none" w:sz="0" w:space="0" w:color="000000"/>
+              <w:left w:val="none" w:sz="0" w:space="0" w:color="000000"/>
+              <w:right w:val="none" w:sz="0" w:space="0" w:color="000000"/>
+            </w:tcBorders>
+            <w:shd w:val="clear" w:color="auto" w:fill="FFFFFF"/>
+            <w:tcMar>
+              <w:top w:w="0" w:type="dxa"/>
+              <w:bottom w:w="0" w:type="dxa"/>
+              <w:left w:w="0" w:type="dxa"/>
+              <w:right w:w="0" w:type="dxa"/>
+            </w:tcMar>
+            <w:vAlign w:val="center"/>
+          </w:tcPr>
+          <w:p>
+            <w:pPr>
+              <w:pStyle w:val="Normal"/>
+              <w:jc w:val="center"/>
+              <w:pBdr>
+                <w:bottom w:val="none" w:sz="0" w:space="0" w:color="000000"/>
+                <w:top w:val="none" w:sz="0" w:space="0" w:color="000000"/>
+                <w:left w:val="none" w:sz="0" w:space="0" w:color="000000"/>
+                <w:right w:val="none" w:sz="0" w:space="0" w:color="000000"/>
+              </w:pBdr>
+              <w:spacing w:after="40" w:before="40" w:line="240"/>
+              <w:ind w:left="40" w:right="40" w:firstLine="0" w:firstLineChars="0"/>
+            </w:pPr>
+            <w:r>
+              <w:rPr>
+                <w:rFonts w:ascii="Helvetica" w:hAnsi="Helvetica" w:eastAsia="Helvetica" w:cs="Helvetica"/>
+                <w:i w:val="false"/>
+                <w:b w:val="false"/>
+                <w:u w:val="none"/>
+                <w:sz w:val="18"/>
+                <w:szCs w:val="18"/>
+                <w:color w:val="000000"/>
+              </w:rPr>
+              <w:t xml:space="preserve">ICP</w:t>
+            </w:r>
+          </w:p>
+        </w:tc>
+        <w:tc>
+          <w:tcPr>
+            <w:tcBorders>
+              <w:bottom w:val="none" w:sz="0" w:space="0" w:color="000000"/>
+              <w:top w:val="none" w:sz="0" w:space="0" w:color="000000"/>
+              <w:left w:val="none" w:sz="0" w:space="0" w:color="000000"/>
+              <w:right w:val="none" w:sz="0" w:space="0" w:color="000000"/>
+            </w:tcBorders>
+            <w:shd w:val="clear" w:color="auto" w:fill="FFFFFF"/>
+            <w:tcMar>
+              <w:top w:w="0" w:type="dxa"/>
+              <w:bottom w:w="0" w:type="dxa"/>
+              <w:left w:w="0" w:type="dxa"/>
+              <w:right w:w="0" w:type="dxa"/>
+            </w:tcMar>
+            <w:vAlign w:val="center"/>
+          </w:tcPr>
+          <w:p>
+            <w:pPr>
+              <w:pStyle w:val="Normal"/>
+              <w:jc w:val="center"/>
+              <w:pBdr>
+                <w:bottom w:val="none" w:sz="0" w:space="0" w:color="000000"/>
+                <w:top w:val="none" w:sz="0" w:space="0" w:color="000000"/>
+                <w:left w:val="none" w:sz="0" w:space="0" w:color="000000"/>
+                <w:right w:val="none" w:sz="0" w:space="0" w:color="000000"/>
+              </w:pBdr>
+              <w:spacing w:after="40" w:before="40" w:line="240"/>
+              <w:ind w:left="40" w:right="40" w:firstLine="0" w:firstLineChars="0"/>
+            </w:pPr>
+            <w:r>
+              <w:rPr>
+                <w:rFonts w:ascii="Helvetica" w:hAnsi="Helvetica" w:eastAsia="Helvetica" w:cs="Helvetica"/>
+                <w:i w:val="false"/>
+                <w:b w:val="false"/>
+                <w:u w:val="none"/>
+                <w:sz w:val="18"/>
+                <w:szCs w:val="18"/>
+                <w:color w:val="000000"/>
+              </w:rPr>
+              <w:t xml:space="preserve">0.6296</w:t>
+            </w:r>
+          </w:p>
+        </w:tc>
+        <w:tc>
+          <w:tcPr>
+            <w:tcBorders>
+              <w:bottom w:val="none" w:sz="0" w:space="0" w:color="000000"/>
+              <w:top w:val="none" w:sz="0" w:space="0" w:color="000000"/>
+              <w:left w:val="none" w:sz="0" w:space="0" w:color="000000"/>
+              <w:right w:val="none" w:sz="0" w:space="0" w:color="000000"/>
+            </w:tcBorders>
+            <w:shd w:val="clear" w:color="auto" w:fill="FFFFFF"/>
+            <w:tcMar>
+              <w:top w:w="0" w:type="dxa"/>
+              <w:bottom w:w="0" w:type="dxa"/>
+              <w:left w:w="0" w:type="dxa"/>
+              <w:right w:w="0" w:type="dxa"/>
+            </w:tcMar>
+            <w:vAlign w:val="center"/>
+          </w:tcPr>
+          <w:p>
+            <w:pPr>
+              <w:pStyle w:val="Normal"/>
+              <w:jc w:val="center"/>
+              <w:pBdr>
+                <w:bottom w:val="none" w:sz="0" w:space="0" w:color="000000"/>
+                <w:top w:val="none" w:sz="0" w:space="0" w:color="000000"/>
+                <w:left w:val="none" w:sz="0" w:space="0" w:color="000000"/>
+                <w:right w:val="none" w:sz="0" w:space="0" w:color="000000"/>
+              </w:pBdr>
+              <w:spacing w:after="40" w:before="40" w:line="240"/>
+              <w:ind w:left="40" w:right="40" w:firstLine="0" w:firstLineChars="0"/>
+            </w:pPr>
+            <w:r>
+              <w:rPr>
+                <w:rFonts w:ascii="Helvetica" w:hAnsi="Helvetica" w:eastAsia="Helvetica" w:cs="Helvetica"/>
+                <w:i w:val="false"/>
+                <w:b w:val="false"/>
+                <w:u w:val="none"/>
+                <w:sz w:val="18"/>
+                <w:szCs w:val="18"/>
+                <w:color w:val="000000"/>
+              </w:rPr>
+              <w:t xml:space="preserve">Original</w:t>
+            </w:r>
+          </w:p>
+        </w:tc>
+        <w:tc>
+          <w:tcPr>
+            <w:tcBorders>
+              <w:bottom w:val="none" w:sz="0" w:space="0" w:color="000000"/>
+              <w:top w:val="none" w:sz="0" w:space="0" w:color="000000"/>
+              <w:left w:val="none" w:sz="0" w:space="0" w:color="000000"/>
+              <w:right w:val="none" w:sz="0" w:space="0" w:color="000000"/>
+            </w:tcBorders>
+            <w:shd w:val="clear" w:color="auto" w:fill="FFFFFF"/>
+            <w:tcMar>
+              <w:top w:w="0" w:type="dxa"/>
+              <w:bottom w:w="0" w:type="dxa"/>
+              <w:left w:w="0" w:type="dxa"/>
+              <w:right w:w="0" w:type="dxa"/>
+            </w:tcMar>
+            <w:vAlign w:val="center"/>
+          </w:tcPr>
+          <w:p>
+            <w:pPr>
+              <w:pStyle w:val="Normal"/>
+              <w:jc w:val="center"/>
+              <w:pBdr>
+                <w:bottom w:val="none" w:sz="0" w:space="0" w:color="000000"/>
+                <w:top w:val="none" w:sz="0" w:space="0" w:color="000000"/>
+                <w:left w:val="none" w:sz="0" w:space="0" w:color="000000"/>
+                <w:right w:val="none" w:sz="0" w:space="0" w:color="000000"/>
+              </w:pBdr>
+              <w:spacing w:after="40" w:before="40" w:line="240"/>
+              <w:ind w:left="40" w:right="40" w:firstLine="0" w:firstLineChars="0"/>
+            </w:pPr>
+            <w:r>
+              <w:rPr>
+                <w:rFonts w:ascii="Helvetica" w:hAnsi="Helvetica" w:eastAsia="Helvetica" w:cs="Helvetica"/>
+                <w:i w:val="false"/>
+                <w:b w:val="false"/>
+                <w:u w:val="none"/>
+                <w:sz w:val="18"/>
+                <w:szCs w:val="18"/>
+                <w:color w:val="000000"/>
+              </w:rPr>
+              <w:t xml:space="preserve">Methods equivalent</w:t>
+            </w:r>
+          </w:p>
+        </w:tc>
+        <w:tc>
+          <w:tcPr>
+            <w:tcBorders>
+              <w:bottom w:val="none" w:sz="0" w:space="0" w:color="000000"/>
+              <w:top w:val="none" w:sz="0" w:space="0" w:color="000000"/>
+              <w:left w:val="none" w:sz="0" w:space="0" w:color="000000"/>
+              <w:right w:val="none" w:sz="0" w:space="0" w:color="000000"/>
+            </w:tcBorders>
+            <w:shd w:val="clear" w:color="auto" w:fill="FFFFFF"/>
+            <w:tcMar>
+              <w:top w:w="0" w:type="dxa"/>
+              <w:bottom w:w="0" w:type="dxa"/>
+              <w:left w:w="0" w:type="dxa"/>
+              <w:right w:w="0" w:type="dxa"/>
+            </w:tcMar>
+            <w:vAlign w:val="center"/>
+          </w:tcPr>
+          <w:p>
+            <w:pPr>
+              <w:pStyle w:val="Normal"/>
+              <w:jc w:val="center"/>
+              <w:pBdr>
+                <w:bottom w:val="none" w:sz="0" w:space="0" w:color="000000"/>
+                <w:top w:val="none" w:sz="0" w:space="0" w:color="000000"/>
+                <w:left w:val="none" w:sz="0" w:space="0" w:color="000000"/>
+                <w:right w:val="none" w:sz="0" w:space="0" w:color="000000"/>
+              </w:pBdr>
+              <w:spacing w:after="40" w:before="40" w:line="240"/>
+              <w:ind w:left="40" w:right="40" w:firstLine="0" w:firstLineChars="0"/>
+            </w:pPr>
+            <w:r>
+              <w:rPr>
+                <w:rFonts w:ascii="Helvetica" w:hAnsi="Helvetica" w:eastAsia="Helvetica" w:cs="Helvetica"/>
+                <w:i w:val="false"/>
+                <w:b w:val="false"/>
+                <w:u w:val="none"/>
+                <w:sz w:val="18"/>
+                <w:szCs w:val="18"/>
+                <w:color w:val="000000"/>
+              </w:rPr>
+              <w:t xml:space="preserve">NS</w:t>
             </w:r>
           </w:p>
         </w:tc>
@@ -1430,95 +1430,51 @@
                 <w:szCs w:val="18"/>
                 <w:color w:val="000000"/>
               </w:rPr>
-              <w:t xml:space="preserve">ICP - PT</w:t>
-            </w:r>
-          </w:p>
-        </w:tc>
-        <w:tc>
-          <w:tcPr>
-            <w:tcBorders>
-              <w:bottom w:val="none" w:sz="0" w:space="0" w:color="000000"/>
-              <w:top w:val="none" w:sz="0" w:space="0" w:color="000000"/>
-              <w:left w:val="none" w:sz="0" w:space="0" w:color="000000"/>
-              <w:right w:val="none" w:sz="0" w:space="0" w:color="000000"/>
-            </w:tcBorders>
-            <w:shd w:val="clear" w:color="auto" w:fill="FFFFFF"/>
-            <w:tcMar>
-              <w:top w:w="0" w:type="dxa"/>
-              <w:bottom w:w="0" w:type="dxa"/>
-              <w:left w:w="0" w:type="dxa"/>
-              <w:right w:w="0" w:type="dxa"/>
-            </w:tcMar>
-            <w:vAlign w:val="center"/>
-          </w:tcPr>
-          <w:p>
-            <w:pPr>
-              <w:pStyle w:val="Normal"/>
-              <w:jc w:val="center"/>
-              <w:pBdr>
-                <w:bottom w:val="none" w:sz="0" w:space="0" w:color="000000"/>
-                <w:top w:val="none" w:sz="0" w:space="0" w:color="000000"/>
-                <w:left w:val="none" w:sz="0" w:space="0" w:color="000000"/>
-                <w:right w:val="none" w:sz="0" w:space="0" w:color="000000"/>
-              </w:pBdr>
-              <w:spacing w:after="40" w:before="40" w:line="240"/>
-              <w:ind w:left="40" w:right="40" w:firstLine="0" w:firstLineChars="0"/>
-            </w:pPr>
-            <w:r>
-              <w:rPr>
-                <w:rFonts w:ascii="Helvetica" w:hAnsi="Helvetica" w:eastAsia="Helvetica" w:cs="Helvetica"/>
-                <w:i w:val="false"/>
-                <w:b w:val="false"/>
-                <w:u w:val="none"/>
-                <w:sz w:val="18"/>
-                <w:szCs w:val="18"/>
-                <w:color w:val="000000"/>
-              </w:rPr>
-              <w:t xml:space="preserve">-4.92</w:t>
-            </w:r>
-          </w:p>
-        </w:tc>
-        <w:tc>
-          <w:tcPr>
-            <w:tcBorders>
-              <w:bottom w:val="none" w:sz="0" w:space="0" w:color="000000"/>
-              <w:top w:val="none" w:sz="0" w:space="0" w:color="000000"/>
-              <w:left w:val="none" w:sz="0" w:space="0" w:color="000000"/>
-              <w:right w:val="none" w:sz="0" w:space="0" w:color="000000"/>
-            </w:tcBorders>
-            <w:shd w:val="clear" w:color="auto" w:fill="FFFFFF"/>
-            <w:tcMar>
-              <w:top w:w="0" w:type="dxa"/>
-              <w:bottom w:w="0" w:type="dxa"/>
-              <w:left w:w="0" w:type="dxa"/>
-              <w:right w:w="0" w:type="dxa"/>
-            </w:tcMar>
-            <w:vAlign w:val="center"/>
-          </w:tcPr>
-          <w:p>
-            <w:pPr>
-              <w:pStyle w:val="Normal"/>
-              <w:jc w:val="center"/>
-              <w:pBdr>
-                <w:bottom w:val="none" w:sz="0" w:space="0" w:color="000000"/>
-                <w:top w:val="none" w:sz="0" w:space="0" w:color="000000"/>
-                <w:left w:val="none" w:sz="0" w:space="0" w:color="000000"/>
-                <w:right w:val="none" w:sz="0" w:space="0" w:color="000000"/>
-              </w:pBdr>
-              <w:spacing w:after="40" w:before="40" w:line="240"/>
-              <w:ind w:left="40" w:right="40" w:firstLine="0" w:firstLineChars="0"/>
-            </w:pPr>
-            <w:r>
-              <w:rPr>
-                <w:rFonts w:ascii="Helvetica" w:hAnsi="Helvetica" w:eastAsia="Helvetica" w:cs="Helvetica"/>
-                <w:i w:val="false"/>
-                <w:b w:val="false"/>
-                <w:u w:val="none"/>
-                <w:sz w:val="18"/>
-                <w:szCs w:val="18"/>
-                <w:color w:val="000000"/>
-              </w:rPr>
-              <w:t xml:space="preserve">0.0000008739839</w:t>
+              <w:t xml:space="preserve">PT</w:t>
+            </w:r>
+          </w:p>
+        </w:tc>
+        <w:tc>
+          <w:tcPr>
+            <w:tcBorders>
+              <w:bottom w:val="none" w:sz="0" w:space="0" w:color="000000"/>
+              <w:top w:val="none" w:sz="0" w:space="0" w:color="000000"/>
+              <w:left w:val="none" w:sz="0" w:space="0" w:color="000000"/>
+              <w:right w:val="none" w:sz="0" w:space="0" w:color="000000"/>
+            </w:tcBorders>
+            <w:shd w:val="clear" w:color="auto" w:fill="FFFFFF"/>
+            <w:tcMar>
+              <w:top w:w="0" w:type="dxa"/>
+              <w:bottom w:w="0" w:type="dxa"/>
+              <w:left w:w="0" w:type="dxa"/>
+              <w:right w:w="0" w:type="dxa"/>
+            </w:tcMar>
+            <w:vAlign w:val="center"/>
+          </w:tcPr>
+          <w:p>
+            <w:pPr>
+              <w:pStyle w:val="Normal"/>
+              <w:jc w:val="center"/>
+              <w:pBdr>
+                <w:bottom w:val="none" w:sz="0" w:space="0" w:color="000000"/>
+                <w:top w:val="none" w:sz="0" w:space="0" w:color="000000"/>
+                <w:left w:val="none" w:sz="0" w:space="0" w:color="000000"/>
+                <w:right w:val="none" w:sz="0" w:space="0" w:color="000000"/>
+              </w:pBdr>
+              <w:spacing w:after="40" w:before="40" w:line="240"/>
+              <w:ind w:left="40" w:right="40" w:firstLine="0" w:firstLineChars="0"/>
+            </w:pPr>
+            <w:r>
+              <w:rPr>
+                <w:rFonts w:ascii="Helvetica" w:hAnsi="Helvetica" w:eastAsia="Helvetica" w:cs="Helvetica"/>
+                <w:i w:val="false"/>
+                <w:b w:val="false"/>
+                <w:u w:val="none"/>
+                <w:sz w:val="18"/>
+                <w:szCs w:val="18"/>
+                <w:color w:val="000000"/>
+              </w:rPr>
+              <w:t xml:space="preserve">ICP</w:t>
             </w:r>
           </w:p>
         </w:tc>
@@ -1563,6 +1519,50 @@
                 <w:color w:val="000000"/>
               </w:rPr>
               <w:t xml:space="preserve">0.0000</w:t>
+            </w:r>
+          </w:p>
+        </w:tc>
+        <w:tc>
+          <w:tcPr>
+            <w:tcBorders>
+              <w:bottom w:val="none" w:sz="0" w:space="0" w:color="000000"/>
+              <w:top w:val="none" w:sz="0" w:space="0" w:color="000000"/>
+              <w:left w:val="none" w:sz="0" w:space="0" w:color="000000"/>
+              <w:right w:val="none" w:sz="0" w:space="0" w:color="000000"/>
+            </w:tcBorders>
+            <w:shd w:val="clear" w:color="auto" w:fill="FFFFFF"/>
+            <w:tcMar>
+              <w:top w:w="0" w:type="dxa"/>
+              <w:bottom w:w="0" w:type="dxa"/>
+              <w:left w:w="0" w:type="dxa"/>
+              <w:right w:w="0" w:type="dxa"/>
+            </w:tcMar>
+            <w:vAlign w:val="center"/>
+          </w:tcPr>
+          <w:p>
+            <w:pPr>
+              <w:pStyle w:val="Normal"/>
+              <w:jc w:val="center"/>
+              <w:pBdr>
+                <w:bottom w:val="none" w:sz="0" w:space="0" w:color="000000"/>
+                <w:top w:val="none" w:sz="0" w:space="0" w:color="000000"/>
+                <w:left w:val="none" w:sz="0" w:space="0" w:color="000000"/>
+                <w:right w:val="none" w:sz="0" w:space="0" w:color="000000"/>
+              </w:pBdr>
+              <w:spacing w:after="40" w:before="40" w:line="240"/>
+              <w:ind w:left="40" w:right="40" w:firstLine="0" w:firstLineChars="0"/>
+            </w:pPr>
+            <w:r>
+              <w:rPr>
+                <w:rFonts w:ascii="Helvetica" w:hAnsi="Helvetica" w:eastAsia="Helvetica" w:cs="Helvetica"/>
+                <w:i w:val="false"/>
+                <w:b w:val="false"/>
+                <w:u w:val="none"/>
+                <w:sz w:val="18"/>
+                <w:szCs w:val="18"/>
+                <w:color w:val="000000"/>
+              </w:rPr>
+              <w:t xml:space="preserve">Original</w:t>
             </w:r>
           </w:p>
         </w:tc>
@@ -1700,139 +1700,139 @@
                 <w:szCs w:val="18"/>
                 <w:color w:val="000000"/>
               </w:rPr>
-              <w:t xml:space="preserve">MT - PT</w:t>
-            </w:r>
-          </w:p>
-        </w:tc>
-        <w:tc>
-          <w:tcPr>
-            <w:tcBorders>
-              <w:bottom w:val="none" w:sz="0" w:space="0" w:color="000000"/>
-              <w:top w:val="none" w:sz="0" w:space="0" w:color="000000"/>
-              <w:left w:val="none" w:sz="0" w:space="0" w:color="000000"/>
-              <w:right w:val="none" w:sz="0" w:space="0" w:color="000000"/>
-            </w:tcBorders>
-            <w:shd w:val="clear" w:color="auto" w:fill="FFFFFF"/>
-            <w:tcMar>
-              <w:top w:w="0" w:type="dxa"/>
-              <w:bottom w:w="0" w:type="dxa"/>
-              <w:left w:w="0" w:type="dxa"/>
-              <w:right w:w="0" w:type="dxa"/>
-            </w:tcMar>
-            <w:vAlign w:val="center"/>
-          </w:tcPr>
-          <w:p>
-            <w:pPr>
-              <w:pStyle w:val="Normal"/>
-              <w:jc w:val="center"/>
-              <w:pBdr>
-                <w:bottom w:val="none" w:sz="0" w:space="0" w:color="000000"/>
-                <w:top w:val="none" w:sz="0" w:space="0" w:color="000000"/>
-                <w:left w:val="none" w:sz="0" w:space="0" w:color="000000"/>
-                <w:right w:val="none" w:sz="0" w:space="0" w:color="000000"/>
-              </w:pBdr>
-              <w:spacing w:after="40" w:before="40" w:line="240"/>
-              <w:ind w:left="40" w:right="40" w:firstLine="0" w:firstLineChars="0"/>
-            </w:pPr>
-            <w:r>
-              <w:rPr>
-                <w:rFonts w:ascii="Helvetica" w:hAnsi="Helvetica" w:eastAsia="Helvetica" w:cs="Helvetica"/>
-                <w:i w:val="false"/>
-                <w:b w:val="false"/>
-                <w:u w:val="none"/>
-                <w:sz w:val="18"/>
-                <w:szCs w:val="18"/>
-                <w:color w:val="000000"/>
-              </w:rPr>
-              <w:t xml:space="preserve">-3.77</w:t>
-            </w:r>
-          </w:p>
-        </w:tc>
-        <w:tc>
-          <w:tcPr>
-            <w:tcBorders>
-              <w:bottom w:val="none" w:sz="0" w:space="0" w:color="000000"/>
-              <w:top w:val="none" w:sz="0" w:space="0" w:color="000000"/>
-              <w:left w:val="none" w:sz="0" w:space="0" w:color="000000"/>
-              <w:right w:val="none" w:sz="0" w:space="0" w:color="000000"/>
-            </w:tcBorders>
-            <w:shd w:val="clear" w:color="auto" w:fill="FFFFFF"/>
-            <w:tcMar>
-              <w:top w:w="0" w:type="dxa"/>
-              <w:bottom w:w="0" w:type="dxa"/>
-              <w:left w:w="0" w:type="dxa"/>
-              <w:right w:w="0" w:type="dxa"/>
-            </w:tcMar>
-            <w:vAlign w:val="center"/>
-          </w:tcPr>
-          <w:p>
-            <w:pPr>
-              <w:pStyle w:val="Normal"/>
-              <w:jc w:val="center"/>
-              <w:pBdr>
-                <w:bottom w:val="none" w:sz="0" w:space="0" w:color="000000"/>
-                <w:top w:val="none" w:sz="0" w:space="0" w:color="000000"/>
-                <w:left w:val="none" w:sz="0" w:space="0" w:color="000000"/>
-                <w:right w:val="none" w:sz="0" w:space="0" w:color="000000"/>
-              </w:pBdr>
-              <w:spacing w:after="40" w:before="40" w:line="240"/>
-              <w:ind w:left="40" w:right="40" w:firstLine="0" w:firstLineChars="0"/>
-            </w:pPr>
-            <w:r>
-              <w:rPr>
-                <w:rFonts w:ascii="Helvetica" w:hAnsi="Helvetica" w:eastAsia="Helvetica" w:cs="Helvetica"/>
-                <w:i w:val="false"/>
-                <w:b w:val="false"/>
-                <w:u w:val="none"/>
-                <w:sz w:val="18"/>
-                <w:szCs w:val="18"/>
-                <w:color w:val="000000"/>
-              </w:rPr>
-              <w:t xml:space="preserve">0.0001617515694</w:t>
-            </w:r>
-          </w:p>
-        </w:tc>
-        <w:tc>
-          <w:tcPr>
-            <w:tcBorders>
-              <w:bottom w:val="none" w:sz="0" w:space="0" w:color="000000"/>
-              <w:top w:val="none" w:sz="0" w:space="0" w:color="000000"/>
-              <w:left w:val="none" w:sz="0" w:space="0" w:color="000000"/>
-              <w:right w:val="none" w:sz="0" w:space="0" w:color="000000"/>
-            </w:tcBorders>
-            <w:shd w:val="clear" w:color="auto" w:fill="FFFFFF"/>
-            <w:tcMar>
-              <w:top w:w="0" w:type="dxa"/>
-              <w:bottom w:w="0" w:type="dxa"/>
-              <w:left w:w="0" w:type="dxa"/>
-              <w:right w:w="0" w:type="dxa"/>
-            </w:tcMar>
-            <w:vAlign w:val="center"/>
-          </w:tcPr>
-          <w:p>
-            <w:pPr>
-              <w:pStyle w:val="Normal"/>
-              <w:jc w:val="center"/>
-              <w:pBdr>
-                <w:bottom w:val="none" w:sz="0" w:space="0" w:color="000000"/>
-                <w:top w:val="none" w:sz="0" w:space="0" w:color="000000"/>
-                <w:left w:val="none" w:sz="0" w:space="0" w:color="000000"/>
-                <w:right w:val="none" w:sz="0" w:space="0" w:color="000000"/>
-              </w:pBdr>
-              <w:spacing w:after="40" w:before="40" w:line="240"/>
-              <w:ind w:left="40" w:right="40" w:firstLine="0" w:firstLineChars="0"/>
-            </w:pPr>
-            <w:r>
-              <w:rPr>
-                <w:rFonts w:ascii="Helvetica" w:hAnsi="Helvetica" w:eastAsia="Helvetica" w:cs="Helvetica"/>
-                <w:i w:val="false"/>
-                <w:b w:val="false"/>
-                <w:u w:val="none"/>
-                <w:sz w:val="18"/>
-                <w:szCs w:val="18"/>
-                <w:color w:val="000000"/>
-              </w:rPr>
-              <w:t xml:space="preserve">0.0010</w:t>
+              <w:t xml:space="preserve">PT</w:t>
+            </w:r>
+          </w:p>
+        </w:tc>
+        <w:tc>
+          <w:tcPr>
+            <w:tcBorders>
+              <w:bottom w:val="none" w:sz="0" w:space="0" w:color="000000"/>
+              <w:top w:val="none" w:sz="0" w:space="0" w:color="000000"/>
+              <w:left w:val="none" w:sz="0" w:space="0" w:color="000000"/>
+              <w:right w:val="none" w:sz="0" w:space="0" w:color="000000"/>
+            </w:tcBorders>
+            <w:shd w:val="clear" w:color="auto" w:fill="FFFFFF"/>
+            <w:tcMar>
+              <w:top w:w="0" w:type="dxa"/>
+              <w:bottom w:w="0" w:type="dxa"/>
+              <w:left w:w="0" w:type="dxa"/>
+              <w:right w:w="0" w:type="dxa"/>
+            </w:tcMar>
+            <w:vAlign w:val="center"/>
+          </w:tcPr>
+          <w:p>
+            <w:pPr>
+              <w:pStyle w:val="Normal"/>
+              <w:jc w:val="center"/>
+              <w:pBdr>
+                <w:bottom w:val="none" w:sz="0" w:space="0" w:color="000000"/>
+                <w:top w:val="none" w:sz="0" w:space="0" w:color="000000"/>
+                <w:left w:val="none" w:sz="0" w:space="0" w:color="000000"/>
+                <w:right w:val="none" w:sz="0" w:space="0" w:color="000000"/>
+              </w:pBdr>
+              <w:spacing w:after="40" w:before="40" w:line="240"/>
+              <w:ind w:left="40" w:right="40" w:firstLine="0" w:firstLineChars="0"/>
+            </w:pPr>
+            <w:r>
+              <w:rPr>
+                <w:rFonts w:ascii="Helvetica" w:hAnsi="Helvetica" w:eastAsia="Helvetica" w:cs="Helvetica"/>
+                <w:i w:val="false"/>
+                <w:b w:val="false"/>
+                <w:u w:val="none"/>
+                <w:sz w:val="18"/>
+                <w:szCs w:val="18"/>
+                <w:color w:val="000000"/>
+              </w:rPr>
+              <w:t xml:space="preserve">MT</w:t>
+            </w:r>
+          </w:p>
+        </w:tc>
+        <w:tc>
+          <w:tcPr>
+            <w:tcBorders>
+              <w:bottom w:val="none" w:sz="0" w:space="0" w:color="000000"/>
+              <w:top w:val="none" w:sz="0" w:space="0" w:color="000000"/>
+              <w:left w:val="none" w:sz="0" w:space="0" w:color="000000"/>
+              <w:right w:val="none" w:sz="0" w:space="0" w:color="000000"/>
+            </w:tcBorders>
+            <w:shd w:val="clear" w:color="auto" w:fill="FFFFFF"/>
+            <w:tcMar>
+              <w:top w:w="0" w:type="dxa"/>
+              <w:bottom w:w="0" w:type="dxa"/>
+              <w:left w:w="0" w:type="dxa"/>
+              <w:right w:w="0" w:type="dxa"/>
+            </w:tcMar>
+            <w:vAlign w:val="center"/>
+          </w:tcPr>
+          <w:p>
+            <w:pPr>
+              <w:pStyle w:val="Normal"/>
+              <w:jc w:val="center"/>
+              <w:pBdr>
+                <w:bottom w:val="none" w:sz="0" w:space="0" w:color="000000"/>
+                <w:top w:val="none" w:sz="0" w:space="0" w:color="000000"/>
+                <w:left w:val="none" w:sz="0" w:space="0" w:color="000000"/>
+                <w:right w:val="none" w:sz="0" w:space="0" w:color="000000"/>
+              </w:pBdr>
+              <w:spacing w:after="40" w:before="40" w:line="240"/>
+              <w:ind w:left="40" w:right="40" w:firstLine="0" w:firstLineChars="0"/>
+            </w:pPr>
+            <w:r>
+              <w:rPr>
+                <w:rFonts w:ascii="Helvetica" w:hAnsi="Helvetica" w:eastAsia="Helvetica" w:cs="Helvetica"/>
+                <w:i w:val="false"/>
+                <w:b w:val="false"/>
+                <w:u w:val="none"/>
+                <w:sz w:val="18"/>
+                <w:szCs w:val="18"/>
+                <w:color w:val="000000"/>
+              </w:rPr>
+              <w:t xml:space="preserve">0.0000</w:t>
+            </w:r>
+          </w:p>
+        </w:tc>
+        <w:tc>
+          <w:tcPr>
+            <w:tcBorders>
+              <w:bottom w:val="none" w:sz="0" w:space="0" w:color="000000"/>
+              <w:top w:val="none" w:sz="0" w:space="0" w:color="000000"/>
+              <w:left w:val="none" w:sz="0" w:space="0" w:color="000000"/>
+              <w:right w:val="none" w:sz="0" w:space="0" w:color="000000"/>
+            </w:tcBorders>
+            <w:shd w:val="clear" w:color="auto" w:fill="FFFFFF"/>
+            <w:tcMar>
+              <w:top w:w="0" w:type="dxa"/>
+              <w:bottom w:w="0" w:type="dxa"/>
+              <w:left w:w="0" w:type="dxa"/>
+              <w:right w:w="0" w:type="dxa"/>
+            </w:tcMar>
+            <w:vAlign w:val="center"/>
+          </w:tcPr>
+          <w:p>
+            <w:pPr>
+              <w:pStyle w:val="Normal"/>
+              <w:jc w:val="center"/>
+              <w:pBdr>
+                <w:bottom w:val="none" w:sz="0" w:space="0" w:color="000000"/>
+                <w:top w:val="none" w:sz="0" w:space="0" w:color="000000"/>
+                <w:left w:val="none" w:sz="0" w:space="0" w:color="000000"/>
+                <w:right w:val="none" w:sz="0" w:space="0" w:color="000000"/>
+              </w:pBdr>
+              <w:spacing w:after="40" w:before="40" w:line="240"/>
+              <w:ind w:left="40" w:right="40" w:firstLine="0" w:firstLineChars="0"/>
+            </w:pPr>
+            <w:r>
+              <w:rPr>
+                <w:rFonts w:ascii="Helvetica" w:hAnsi="Helvetica" w:eastAsia="Helvetica" w:cs="Helvetica"/>
+                <w:i w:val="false"/>
+                <w:b w:val="false"/>
+                <w:u w:val="none"/>
+                <w:sz w:val="18"/>
+                <w:szCs w:val="18"/>
+                <w:color w:val="000000"/>
+              </w:rPr>
+              <w:t xml:space="preserve">Original</w:t>
             </w:r>
           </w:p>
         </w:tc>
@@ -1970,139 +1970,139 @@
                 <w:szCs w:val="18"/>
                 <w:color w:val="000000"/>
               </w:rPr>
-              <w:t xml:space="preserve">logIC - logICP</w:t>
-            </w:r>
-          </w:p>
-        </w:tc>
-        <w:tc>
-          <w:tcPr>
-            <w:tcBorders>
-              <w:bottom w:val="none" w:sz="0" w:space="0" w:color="000000"/>
-              <w:top w:val="none" w:sz="0" w:space="0" w:color="000000"/>
-              <w:left w:val="none" w:sz="0" w:space="0" w:color="000000"/>
-              <w:right w:val="none" w:sz="0" w:space="0" w:color="000000"/>
-            </w:tcBorders>
-            <w:shd w:val="clear" w:color="auto" w:fill="FFFFFF"/>
-            <w:tcMar>
-              <w:top w:w="0" w:type="dxa"/>
-              <w:bottom w:w="0" w:type="dxa"/>
-              <w:left w:w="0" w:type="dxa"/>
-              <w:right w:w="0" w:type="dxa"/>
-            </w:tcMar>
-            <w:vAlign w:val="center"/>
-          </w:tcPr>
-          <w:p>
-            <w:pPr>
-              <w:pStyle w:val="Normal"/>
-              <w:jc w:val="center"/>
-              <w:pBdr>
-                <w:bottom w:val="none" w:sz="0" w:space="0" w:color="000000"/>
-                <w:top w:val="none" w:sz="0" w:space="0" w:color="000000"/>
-                <w:left w:val="none" w:sz="0" w:space="0" w:color="000000"/>
-                <w:right w:val="none" w:sz="0" w:space="0" w:color="000000"/>
-              </w:pBdr>
-              <w:spacing w:after="40" w:before="40" w:line="240"/>
-              <w:ind w:left="40" w:right="40" w:firstLine="0" w:firstLineChars="0"/>
-            </w:pPr>
-            <w:r>
-              <w:rPr>
-                <w:rFonts w:ascii="Helvetica" w:hAnsi="Helvetica" w:eastAsia="Helvetica" w:cs="Helvetica"/>
-                <w:i w:val="false"/>
-                <w:b w:val="false"/>
-                <w:u w:val="none"/>
-                <w:sz w:val="18"/>
-                <w:szCs w:val="18"/>
-                <w:color w:val="000000"/>
-              </w:rPr>
-              <w:t xml:space="preserve">0.29</w:t>
-            </w:r>
-          </w:p>
-        </w:tc>
-        <w:tc>
-          <w:tcPr>
-            <w:tcBorders>
-              <w:bottom w:val="none" w:sz="0" w:space="0" w:color="000000"/>
-              <w:top w:val="none" w:sz="0" w:space="0" w:color="000000"/>
-              <w:left w:val="none" w:sz="0" w:space="0" w:color="000000"/>
-              <w:right w:val="none" w:sz="0" w:space="0" w:color="000000"/>
-            </w:tcBorders>
-            <w:shd w:val="clear" w:color="auto" w:fill="FFFFFF"/>
-            <w:tcMar>
-              <w:top w:w="0" w:type="dxa"/>
-              <w:bottom w:w="0" w:type="dxa"/>
-              <w:left w:w="0" w:type="dxa"/>
-              <w:right w:w="0" w:type="dxa"/>
-            </w:tcMar>
-            <w:vAlign w:val="center"/>
-          </w:tcPr>
-          <w:p>
-            <w:pPr>
-              <w:pStyle w:val="Normal"/>
-              <w:jc w:val="center"/>
-              <w:pBdr>
-                <w:bottom w:val="none" w:sz="0" w:space="0" w:color="000000"/>
-                <w:top w:val="none" w:sz="0" w:space="0" w:color="000000"/>
-                <w:left w:val="none" w:sz="0" w:space="0" w:color="000000"/>
-                <w:right w:val="none" w:sz="0" w:space="0" w:color="000000"/>
-              </w:pBdr>
-              <w:spacing w:after="40" w:before="40" w:line="240"/>
-              <w:ind w:left="40" w:right="40" w:firstLine="0" w:firstLineChars="0"/>
-            </w:pPr>
-            <w:r>
-              <w:rPr>
-                <w:rFonts w:ascii="Helvetica" w:hAnsi="Helvetica" w:eastAsia="Helvetica" w:cs="Helvetica"/>
-                <w:i w:val="false"/>
-                <w:b w:val="false"/>
-                <w:u w:val="none"/>
-                <w:sz w:val="18"/>
-                <w:szCs w:val="18"/>
-                <w:color w:val="000000"/>
-              </w:rPr>
-              <w:t xml:space="preserve">0.7697944234440</w:t>
-            </w:r>
-          </w:p>
-        </w:tc>
-        <w:tc>
-          <w:tcPr>
-            <w:tcBorders>
-              <w:bottom w:val="none" w:sz="0" w:space="0" w:color="000000"/>
-              <w:top w:val="none" w:sz="0" w:space="0" w:color="000000"/>
-              <w:left w:val="none" w:sz="0" w:space="0" w:color="000000"/>
-              <w:right w:val="none" w:sz="0" w:space="0" w:color="000000"/>
-            </w:tcBorders>
-            <w:shd w:val="clear" w:color="auto" w:fill="FFFFFF"/>
-            <w:tcMar>
-              <w:top w:w="0" w:type="dxa"/>
-              <w:bottom w:w="0" w:type="dxa"/>
-              <w:left w:w="0" w:type="dxa"/>
-              <w:right w:w="0" w:type="dxa"/>
-            </w:tcMar>
-            <w:vAlign w:val="center"/>
-          </w:tcPr>
-          <w:p>
-            <w:pPr>
-              <w:pStyle w:val="Normal"/>
-              <w:jc w:val="center"/>
-              <w:pBdr>
-                <w:bottom w:val="none" w:sz="0" w:space="0" w:color="000000"/>
-                <w:top w:val="none" w:sz="0" w:space="0" w:color="000000"/>
-                <w:left w:val="none" w:sz="0" w:space="0" w:color="000000"/>
-                <w:right w:val="none" w:sz="0" w:space="0" w:color="000000"/>
-              </w:pBdr>
-              <w:spacing w:after="40" w:before="40" w:line="240"/>
-              <w:ind w:left="40" w:right="40" w:firstLine="0" w:firstLineChars="0"/>
-            </w:pPr>
-            <w:r>
-              <w:rPr>
-                <w:rFonts w:ascii="Helvetica" w:hAnsi="Helvetica" w:eastAsia="Helvetica" w:cs="Helvetica"/>
-                <w:i w:val="false"/>
-                <w:b w:val="false"/>
-                <w:u w:val="none"/>
-                <w:sz w:val="18"/>
-                <w:szCs w:val="18"/>
-                <w:color w:val="000000"/>
-              </w:rPr>
-              <w:t xml:space="preserve">1.0000</w:t>
+              <w:t xml:space="preserve">logICP</w:t>
+            </w:r>
+          </w:p>
+        </w:tc>
+        <w:tc>
+          <w:tcPr>
+            <w:tcBorders>
+              <w:bottom w:val="none" w:sz="0" w:space="0" w:color="000000"/>
+              <w:top w:val="none" w:sz="0" w:space="0" w:color="000000"/>
+              <w:left w:val="none" w:sz="0" w:space="0" w:color="000000"/>
+              <w:right w:val="none" w:sz="0" w:space="0" w:color="000000"/>
+            </w:tcBorders>
+            <w:shd w:val="clear" w:color="auto" w:fill="FFFFFF"/>
+            <w:tcMar>
+              <w:top w:w="0" w:type="dxa"/>
+              <w:bottom w:w="0" w:type="dxa"/>
+              <w:left w:w="0" w:type="dxa"/>
+              <w:right w:w="0" w:type="dxa"/>
+            </w:tcMar>
+            <w:vAlign w:val="center"/>
+          </w:tcPr>
+          <w:p>
+            <w:pPr>
+              <w:pStyle w:val="Normal"/>
+              <w:jc w:val="center"/>
+              <w:pBdr>
+                <w:bottom w:val="none" w:sz="0" w:space="0" w:color="000000"/>
+                <w:top w:val="none" w:sz="0" w:space="0" w:color="000000"/>
+                <w:left w:val="none" w:sz="0" w:space="0" w:color="000000"/>
+                <w:right w:val="none" w:sz="0" w:space="0" w:color="000000"/>
+              </w:pBdr>
+              <w:spacing w:after="40" w:before="40" w:line="240"/>
+              <w:ind w:left="40" w:right="40" w:firstLine="0" w:firstLineChars="0"/>
+            </w:pPr>
+            <w:r>
+              <w:rPr>
+                <w:rFonts w:ascii="Helvetica" w:hAnsi="Helvetica" w:eastAsia="Helvetica" w:cs="Helvetica"/>
+                <w:i w:val="false"/>
+                <w:b w:val="false"/>
+                <w:u w:val="none"/>
+                <w:sz w:val="18"/>
+                <w:szCs w:val="18"/>
+                <w:color w:val="000000"/>
+              </w:rPr>
+              <w:t xml:space="preserve">logIC</w:t>
+            </w:r>
+          </w:p>
+        </w:tc>
+        <w:tc>
+          <w:tcPr>
+            <w:tcBorders>
+              <w:bottom w:val="none" w:sz="0" w:space="0" w:color="000000"/>
+              <w:top w:val="none" w:sz="0" w:space="0" w:color="000000"/>
+              <w:left w:val="none" w:sz="0" w:space="0" w:color="000000"/>
+              <w:right w:val="none" w:sz="0" w:space="0" w:color="000000"/>
+            </w:tcBorders>
+            <w:shd w:val="clear" w:color="auto" w:fill="FFFFFF"/>
+            <w:tcMar>
+              <w:top w:w="0" w:type="dxa"/>
+              <w:bottom w:w="0" w:type="dxa"/>
+              <w:left w:w="0" w:type="dxa"/>
+              <w:right w:w="0" w:type="dxa"/>
+            </w:tcMar>
+            <w:vAlign w:val="center"/>
+          </w:tcPr>
+          <w:p>
+            <w:pPr>
+              <w:pStyle w:val="Normal"/>
+              <w:jc w:val="center"/>
+              <w:pBdr>
+                <w:bottom w:val="none" w:sz="0" w:space="0" w:color="000000"/>
+                <w:top w:val="none" w:sz="0" w:space="0" w:color="000000"/>
+                <w:left w:val="none" w:sz="0" w:space="0" w:color="000000"/>
+                <w:right w:val="none" w:sz="0" w:space="0" w:color="000000"/>
+              </w:pBdr>
+              <w:spacing w:after="40" w:before="40" w:line="240"/>
+              <w:ind w:left="40" w:right="40" w:firstLine="0" w:firstLineChars="0"/>
+            </w:pPr>
+            <w:r>
+              <w:rPr>
+                <w:rFonts w:ascii="Helvetica" w:hAnsi="Helvetica" w:eastAsia="Helvetica" w:cs="Helvetica"/>
+                <w:i w:val="false"/>
+                <w:b w:val="false"/>
+                <w:u w:val="none"/>
+                <w:sz w:val="18"/>
+                <w:szCs w:val="18"/>
+                <w:color w:val="000000"/>
+              </w:rPr>
+              <w:t xml:space="preserve">0.2277</w:t>
+            </w:r>
+          </w:p>
+        </w:tc>
+        <w:tc>
+          <w:tcPr>
+            <w:tcBorders>
+              <w:bottom w:val="none" w:sz="0" w:space="0" w:color="000000"/>
+              <w:top w:val="none" w:sz="0" w:space="0" w:color="000000"/>
+              <w:left w:val="none" w:sz="0" w:space="0" w:color="000000"/>
+              <w:right w:val="none" w:sz="0" w:space="0" w:color="000000"/>
+            </w:tcBorders>
+            <w:shd w:val="clear" w:color="auto" w:fill="FFFFFF"/>
+            <w:tcMar>
+              <w:top w:w="0" w:type="dxa"/>
+              <w:bottom w:w="0" w:type="dxa"/>
+              <w:left w:w="0" w:type="dxa"/>
+              <w:right w:w="0" w:type="dxa"/>
+            </w:tcMar>
+            <w:vAlign w:val="center"/>
+          </w:tcPr>
+          <w:p>
+            <w:pPr>
+              <w:pStyle w:val="Normal"/>
+              <w:jc w:val="center"/>
+              <w:pBdr>
+                <w:bottom w:val="none" w:sz="0" w:space="0" w:color="000000"/>
+                <w:top w:val="none" w:sz="0" w:space="0" w:color="000000"/>
+                <w:left w:val="none" w:sz="0" w:space="0" w:color="000000"/>
+                <w:right w:val="none" w:sz="0" w:space="0" w:color="000000"/>
+              </w:pBdr>
+              <w:spacing w:after="40" w:before="40" w:line="240"/>
+              <w:ind w:left="40" w:right="40" w:firstLine="0" w:firstLineChars="0"/>
+            </w:pPr>
+            <w:r>
+              <w:rPr>
+                <w:rFonts w:ascii="Helvetica" w:hAnsi="Helvetica" w:eastAsia="Helvetica" w:cs="Helvetica"/>
+                <w:i w:val="false"/>
+                <w:b w:val="false"/>
+                <w:u w:val="none"/>
+                <w:sz w:val="18"/>
+                <w:szCs w:val="18"/>
+                <w:color w:val="000000"/>
+              </w:rPr>
+              <w:t xml:space="preserve">Log</w:t>
             </w:r>
           </w:p>
         </w:tc>
@@ -2240,227 +2240,227 @@
                 <w:szCs w:val="18"/>
                 <w:color w:val="000000"/>
               </w:rPr>
-              <w:t xml:space="preserve">logIC - logMT</w:t>
-            </w:r>
-          </w:p>
-        </w:tc>
-        <w:tc>
-          <w:tcPr>
-            <w:tcBorders>
-              <w:bottom w:val="none" w:sz="0" w:space="0" w:color="000000"/>
-              <w:top w:val="none" w:sz="0" w:space="0" w:color="000000"/>
-              <w:left w:val="none" w:sz="0" w:space="0" w:color="000000"/>
-              <w:right w:val="none" w:sz="0" w:space="0" w:color="000000"/>
-            </w:tcBorders>
-            <w:shd w:val="clear" w:color="auto" w:fill="FFFFFF"/>
-            <w:tcMar>
-              <w:top w:w="0" w:type="dxa"/>
-              <w:bottom w:w="0" w:type="dxa"/>
-              <w:left w:w="0" w:type="dxa"/>
-              <w:right w:w="0" w:type="dxa"/>
-            </w:tcMar>
-            <w:vAlign w:val="center"/>
-          </w:tcPr>
-          <w:p>
-            <w:pPr>
-              <w:pStyle w:val="Normal"/>
-              <w:jc w:val="center"/>
-              <w:pBdr>
-                <w:bottom w:val="none" w:sz="0" w:space="0" w:color="000000"/>
-                <w:top w:val="none" w:sz="0" w:space="0" w:color="000000"/>
-                <w:left w:val="none" w:sz="0" w:space="0" w:color="000000"/>
-                <w:right w:val="none" w:sz="0" w:space="0" w:color="000000"/>
-              </w:pBdr>
-              <w:spacing w:after="40" w:before="40" w:line="240"/>
-              <w:ind w:left="40" w:right="40" w:firstLine="0" w:firstLineChars="0"/>
-            </w:pPr>
-            <w:r>
-              <w:rPr>
-                <w:rFonts w:ascii="Helvetica" w:hAnsi="Helvetica" w:eastAsia="Helvetica" w:cs="Helvetica"/>
-                <w:i w:val="false"/>
-                <w:b w:val="false"/>
-                <w:u w:val="none"/>
-                <w:sz w:val="18"/>
-                <w:szCs w:val="18"/>
-                <w:color w:val="000000"/>
-              </w:rPr>
-              <w:t xml:space="preserve">-0.85</w:t>
-            </w:r>
-          </w:p>
-        </w:tc>
-        <w:tc>
-          <w:tcPr>
-            <w:tcBorders>
-              <w:bottom w:val="none" w:sz="0" w:space="0" w:color="000000"/>
-              <w:top w:val="none" w:sz="0" w:space="0" w:color="000000"/>
-              <w:left w:val="none" w:sz="0" w:space="0" w:color="000000"/>
-              <w:right w:val="none" w:sz="0" w:space="0" w:color="000000"/>
-            </w:tcBorders>
-            <w:shd w:val="clear" w:color="auto" w:fill="FFFFFF"/>
-            <w:tcMar>
-              <w:top w:w="0" w:type="dxa"/>
-              <w:bottom w:w="0" w:type="dxa"/>
-              <w:left w:w="0" w:type="dxa"/>
-              <w:right w:w="0" w:type="dxa"/>
-            </w:tcMar>
-            <w:vAlign w:val="center"/>
-          </w:tcPr>
-          <w:p>
-            <w:pPr>
-              <w:pStyle w:val="Normal"/>
-              <w:jc w:val="center"/>
-              <w:pBdr>
-                <w:bottom w:val="none" w:sz="0" w:space="0" w:color="000000"/>
-                <w:top w:val="none" w:sz="0" w:space="0" w:color="000000"/>
-                <w:left w:val="none" w:sz="0" w:space="0" w:color="000000"/>
-                <w:right w:val="none" w:sz="0" w:space="0" w:color="000000"/>
-              </w:pBdr>
-              <w:spacing w:after="40" w:before="40" w:line="240"/>
-              <w:ind w:left="40" w:right="40" w:firstLine="0" w:firstLineChars="0"/>
-            </w:pPr>
-            <w:r>
-              <w:rPr>
-                <w:rFonts w:ascii="Helvetica" w:hAnsi="Helvetica" w:eastAsia="Helvetica" w:cs="Helvetica"/>
-                <w:i w:val="false"/>
-                <w:b w:val="false"/>
-                <w:u w:val="none"/>
-                <w:sz w:val="18"/>
-                <w:szCs w:val="18"/>
-                <w:color w:val="000000"/>
-              </w:rPr>
-              <w:t xml:space="preserve">0.3939268607276</w:t>
-            </w:r>
-          </w:p>
-        </w:tc>
-        <w:tc>
-          <w:tcPr>
-            <w:tcBorders>
-              <w:bottom w:val="none" w:sz="0" w:space="0" w:color="000000"/>
-              <w:top w:val="none" w:sz="0" w:space="0" w:color="000000"/>
-              <w:left w:val="none" w:sz="0" w:space="0" w:color="000000"/>
-              <w:right w:val="none" w:sz="0" w:space="0" w:color="000000"/>
-            </w:tcBorders>
-            <w:shd w:val="clear" w:color="auto" w:fill="FFFFFF"/>
-            <w:tcMar>
-              <w:top w:w="0" w:type="dxa"/>
-              <w:bottom w:w="0" w:type="dxa"/>
-              <w:left w:w="0" w:type="dxa"/>
-              <w:right w:w="0" w:type="dxa"/>
-            </w:tcMar>
-            <w:vAlign w:val="center"/>
-          </w:tcPr>
-          <w:p>
-            <w:pPr>
-              <w:pStyle w:val="Normal"/>
-              <w:jc w:val="center"/>
-              <w:pBdr>
-                <w:bottom w:val="none" w:sz="0" w:space="0" w:color="000000"/>
-                <w:top w:val="none" w:sz="0" w:space="0" w:color="000000"/>
-                <w:left w:val="none" w:sz="0" w:space="0" w:color="000000"/>
-                <w:right w:val="none" w:sz="0" w:space="0" w:color="000000"/>
-              </w:pBdr>
-              <w:spacing w:after="40" w:before="40" w:line="240"/>
-              <w:ind w:left="40" w:right="40" w:firstLine="0" w:firstLineChars="0"/>
-            </w:pPr>
-            <w:r>
-              <w:rPr>
-                <w:rFonts w:ascii="Helvetica" w:hAnsi="Helvetica" w:eastAsia="Helvetica" w:cs="Helvetica"/>
-                <w:i w:val="false"/>
-                <w:b w:val="false"/>
-                <w:u w:val="none"/>
-                <w:sz w:val="18"/>
-                <w:szCs w:val="18"/>
-                <w:color w:val="000000"/>
-              </w:rPr>
-              <w:t xml:space="preserve">1.0000</w:t>
-            </w:r>
-          </w:p>
-        </w:tc>
-        <w:tc>
-          <w:tcPr>
-            <w:tcBorders>
-              <w:bottom w:val="none" w:sz="0" w:space="0" w:color="000000"/>
-              <w:top w:val="none" w:sz="0" w:space="0" w:color="000000"/>
-              <w:left w:val="none" w:sz="0" w:space="0" w:color="000000"/>
-              <w:right w:val="none" w:sz="0" w:space="0" w:color="000000"/>
-            </w:tcBorders>
-            <w:shd w:val="clear" w:color="auto" w:fill="FFFFFF"/>
-            <w:tcMar>
-              <w:top w:w="0" w:type="dxa"/>
-              <w:bottom w:w="0" w:type="dxa"/>
-              <w:left w:w="0" w:type="dxa"/>
-              <w:right w:w="0" w:type="dxa"/>
-            </w:tcMar>
-            <w:vAlign w:val="center"/>
-          </w:tcPr>
-          <w:p>
-            <w:pPr>
-              <w:pStyle w:val="Normal"/>
-              <w:jc w:val="center"/>
-              <w:pBdr>
-                <w:bottom w:val="none" w:sz="0" w:space="0" w:color="000000"/>
-                <w:top w:val="none" w:sz="0" w:space="0" w:color="000000"/>
-                <w:left w:val="none" w:sz="0" w:space="0" w:color="000000"/>
-                <w:right w:val="none" w:sz="0" w:space="0" w:color="000000"/>
-              </w:pBdr>
-              <w:spacing w:after="40" w:before="40" w:line="240"/>
-              <w:ind w:left="40" w:right="40" w:firstLine="0" w:firstLineChars="0"/>
-            </w:pPr>
-            <w:r>
-              <w:rPr>
-                <w:rFonts w:ascii="Helvetica" w:hAnsi="Helvetica" w:eastAsia="Helvetica" w:cs="Helvetica"/>
-                <w:i w:val="false"/>
-                <w:b w:val="false"/>
-                <w:u w:val="none"/>
-                <w:sz w:val="18"/>
-                <w:szCs w:val="18"/>
-                <w:color w:val="000000"/>
-              </w:rPr>
-              <w:t xml:space="preserve">Methods equivalent</w:t>
-            </w:r>
-          </w:p>
-        </w:tc>
-        <w:tc>
-          <w:tcPr>
-            <w:tcBorders>
-              <w:bottom w:val="none" w:sz="0" w:space="0" w:color="000000"/>
-              <w:top w:val="none" w:sz="0" w:space="0" w:color="000000"/>
-              <w:left w:val="none" w:sz="0" w:space="0" w:color="000000"/>
-              <w:right w:val="none" w:sz="0" w:space="0" w:color="000000"/>
-            </w:tcBorders>
-            <w:shd w:val="clear" w:color="auto" w:fill="FFFFFF"/>
-            <w:tcMar>
-              <w:top w:w="0" w:type="dxa"/>
-              <w:bottom w:w="0" w:type="dxa"/>
-              <w:left w:w="0" w:type="dxa"/>
-              <w:right w:w="0" w:type="dxa"/>
-            </w:tcMar>
-            <w:vAlign w:val="center"/>
-          </w:tcPr>
-          <w:p>
-            <w:pPr>
-              <w:pStyle w:val="Normal"/>
-              <w:jc w:val="center"/>
-              <w:pBdr>
-                <w:bottom w:val="none" w:sz="0" w:space="0" w:color="000000"/>
-                <w:top w:val="none" w:sz="0" w:space="0" w:color="000000"/>
-                <w:left w:val="none" w:sz="0" w:space="0" w:color="000000"/>
-                <w:right w:val="none" w:sz="0" w:space="0" w:color="000000"/>
-              </w:pBdr>
-              <w:spacing w:after="40" w:before="40" w:line="240"/>
-              <w:ind w:left="40" w:right="40" w:firstLine="0" w:firstLineChars="0"/>
-            </w:pPr>
-            <w:r>
-              <w:rPr>
-                <w:rFonts w:ascii="Helvetica" w:hAnsi="Helvetica" w:eastAsia="Helvetica" w:cs="Helvetica"/>
-                <w:i w:val="false"/>
-                <w:b w:val="false"/>
-                <w:u w:val="none"/>
-                <w:sz w:val="18"/>
-                <w:szCs w:val="18"/>
-                <w:color w:val="000000"/>
-              </w:rPr>
-              <w:t xml:space="preserve">NS</w:t>
+              <w:t xml:space="preserve">logMT</w:t>
+            </w:r>
+          </w:p>
+        </w:tc>
+        <w:tc>
+          <w:tcPr>
+            <w:tcBorders>
+              <w:bottom w:val="none" w:sz="0" w:space="0" w:color="000000"/>
+              <w:top w:val="none" w:sz="0" w:space="0" w:color="000000"/>
+              <w:left w:val="none" w:sz="0" w:space="0" w:color="000000"/>
+              <w:right w:val="none" w:sz="0" w:space="0" w:color="000000"/>
+            </w:tcBorders>
+            <w:shd w:val="clear" w:color="auto" w:fill="FFFFFF"/>
+            <w:tcMar>
+              <w:top w:w="0" w:type="dxa"/>
+              <w:bottom w:w="0" w:type="dxa"/>
+              <w:left w:w="0" w:type="dxa"/>
+              <w:right w:w="0" w:type="dxa"/>
+            </w:tcMar>
+            <w:vAlign w:val="center"/>
+          </w:tcPr>
+          <w:p>
+            <w:pPr>
+              <w:pStyle w:val="Normal"/>
+              <w:jc w:val="center"/>
+              <w:pBdr>
+                <w:bottom w:val="none" w:sz="0" w:space="0" w:color="000000"/>
+                <w:top w:val="none" w:sz="0" w:space="0" w:color="000000"/>
+                <w:left w:val="none" w:sz="0" w:space="0" w:color="000000"/>
+                <w:right w:val="none" w:sz="0" w:space="0" w:color="000000"/>
+              </w:pBdr>
+              <w:spacing w:after="40" w:before="40" w:line="240"/>
+              <w:ind w:left="40" w:right="40" w:firstLine="0" w:firstLineChars="0"/>
+            </w:pPr>
+            <w:r>
+              <w:rPr>
+                <w:rFonts w:ascii="Helvetica" w:hAnsi="Helvetica" w:eastAsia="Helvetica" w:cs="Helvetica"/>
+                <w:i w:val="false"/>
+                <w:b w:val="false"/>
+                <w:u w:val="none"/>
+                <w:sz w:val="18"/>
+                <w:szCs w:val="18"/>
+                <w:color w:val="000000"/>
+              </w:rPr>
+              <w:t xml:space="preserve">logIC</w:t>
+            </w:r>
+          </w:p>
+        </w:tc>
+        <w:tc>
+          <w:tcPr>
+            <w:tcBorders>
+              <w:bottom w:val="none" w:sz="0" w:space="0" w:color="000000"/>
+              <w:top w:val="none" w:sz="0" w:space="0" w:color="000000"/>
+              <w:left w:val="none" w:sz="0" w:space="0" w:color="000000"/>
+              <w:right w:val="none" w:sz="0" w:space="0" w:color="000000"/>
+            </w:tcBorders>
+            <w:shd w:val="clear" w:color="auto" w:fill="FFFFFF"/>
+            <w:tcMar>
+              <w:top w:w="0" w:type="dxa"/>
+              <w:bottom w:w="0" w:type="dxa"/>
+              <w:left w:w="0" w:type="dxa"/>
+              <w:right w:w="0" w:type="dxa"/>
+            </w:tcMar>
+            <w:vAlign w:val="center"/>
+          </w:tcPr>
+          <w:p>
+            <w:pPr>
+              <w:pStyle w:val="Normal"/>
+              <w:jc w:val="center"/>
+              <w:pBdr>
+                <w:bottom w:val="none" w:sz="0" w:space="0" w:color="000000"/>
+                <w:top w:val="none" w:sz="0" w:space="0" w:color="000000"/>
+                <w:left w:val="none" w:sz="0" w:space="0" w:color="000000"/>
+                <w:right w:val="none" w:sz="0" w:space="0" w:color="000000"/>
+              </w:pBdr>
+              <w:spacing w:after="40" w:before="40" w:line="240"/>
+              <w:ind w:left="40" w:right="40" w:firstLine="0" w:firstLineChars="0"/>
+            </w:pPr>
+            <w:r>
+              <w:rPr>
+                <w:rFonts w:ascii="Helvetica" w:hAnsi="Helvetica" w:eastAsia="Helvetica" w:cs="Helvetica"/>
+                <w:i w:val="false"/>
+                <w:b w:val="false"/>
+                <w:u w:val="none"/>
+                <w:sz w:val="18"/>
+                <w:szCs w:val="18"/>
+                <w:color w:val="000000"/>
+              </w:rPr>
+              <w:t xml:space="preserve">0.0136</w:t>
+            </w:r>
+          </w:p>
+        </w:tc>
+        <w:tc>
+          <w:tcPr>
+            <w:tcBorders>
+              <w:bottom w:val="none" w:sz="0" w:space="0" w:color="000000"/>
+              <w:top w:val="none" w:sz="0" w:space="0" w:color="000000"/>
+              <w:left w:val="none" w:sz="0" w:space="0" w:color="000000"/>
+              <w:right w:val="none" w:sz="0" w:space="0" w:color="000000"/>
+            </w:tcBorders>
+            <w:shd w:val="clear" w:color="auto" w:fill="FFFFFF"/>
+            <w:tcMar>
+              <w:top w:w="0" w:type="dxa"/>
+              <w:bottom w:w="0" w:type="dxa"/>
+              <w:left w:w="0" w:type="dxa"/>
+              <w:right w:w="0" w:type="dxa"/>
+            </w:tcMar>
+            <w:vAlign w:val="center"/>
+          </w:tcPr>
+          <w:p>
+            <w:pPr>
+              <w:pStyle w:val="Normal"/>
+              <w:jc w:val="center"/>
+              <w:pBdr>
+                <w:bottom w:val="none" w:sz="0" w:space="0" w:color="000000"/>
+                <w:top w:val="none" w:sz="0" w:space="0" w:color="000000"/>
+                <w:left w:val="none" w:sz="0" w:space="0" w:color="000000"/>
+                <w:right w:val="none" w:sz="0" w:space="0" w:color="000000"/>
+              </w:pBdr>
+              <w:spacing w:after="40" w:before="40" w:line="240"/>
+              <w:ind w:left="40" w:right="40" w:firstLine="0" w:firstLineChars="0"/>
+            </w:pPr>
+            <w:r>
+              <w:rPr>
+                <w:rFonts w:ascii="Helvetica" w:hAnsi="Helvetica" w:eastAsia="Helvetica" w:cs="Helvetica"/>
+                <w:i w:val="false"/>
+                <w:b w:val="false"/>
+                <w:u w:val="none"/>
+                <w:sz w:val="18"/>
+                <w:szCs w:val="18"/>
+                <w:color w:val="000000"/>
+              </w:rPr>
+              <w:t xml:space="preserve">Log</w:t>
+            </w:r>
+          </w:p>
+        </w:tc>
+        <w:tc>
+          <w:tcPr>
+            <w:tcBorders>
+              <w:bottom w:val="none" w:sz="0" w:space="0" w:color="000000"/>
+              <w:top w:val="none" w:sz="0" w:space="0" w:color="000000"/>
+              <w:left w:val="none" w:sz="0" w:space="0" w:color="000000"/>
+              <w:right w:val="none" w:sz="0" w:space="0" w:color="000000"/>
+            </w:tcBorders>
+            <w:shd w:val="clear" w:color="auto" w:fill="FFFFFF"/>
+            <w:tcMar>
+              <w:top w:w="0" w:type="dxa"/>
+              <w:bottom w:w="0" w:type="dxa"/>
+              <w:left w:w="0" w:type="dxa"/>
+              <w:right w:w="0" w:type="dxa"/>
+            </w:tcMar>
+            <w:vAlign w:val="center"/>
+          </w:tcPr>
+          <w:p>
+            <w:pPr>
+              <w:pStyle w:val="Normal"/>
+              <w:jc w:val="center"/>
+              <w:pBdr>
+                <w:bottom w:val="none" w:sz="0" w:space="0" w:color="000000"/>
+                <w:top w:val="none" w:sz="0" w:space="0" w:color="000000"/>
+                <w:left w:val="none" w:sz="0" w:space="0" w:color="000000"/>
+                <w:right w:val="none" w:sz="0" w:space="0" w:color="000000"/>
+              </w:pBdr>
+              <w:spacing w:after="40" w:before="40" w:line="240"/>
+              <w:ind w:left="40" w:right="40" w:firstLine="0" w:firstLineChars="0"/>
+            </w:pPr>
+            <w:r>
+              <w:rPr>
+                <w:rFonts w:ascii="Helvetica" w:hAnsi="Helvetica" w:eastAsia="Helvetica" w:cs="Helvetica"/>
+                <w:i w:val="false"/>
+                <w:b w:val="false"/>
+                <w:u w:val="none"/>
+                <w:sz w:val="18"/>
+                <w:szCs w:val="18"/>
+                <w:color w:val="000000"/>
+              </w:rPr>
+              <w:t xml:space="preserve">Signif. different</w:t>
+            </w:r>
+          </w:p>
+        </w:tc>
+        <w:tc>
+          <w:tcPr>
+            <w:tcBorders>
+              <w:bottom w:val="none" w:sz="0" w:space="0" w:color="000000"/>
+              <w:top w:val="none" w:sz="0" w:space="0" w:color="000000"/>
+              <w:left w:val="none" w:sz="0" w:space="0" w:color="000000"/>
+              <w:right w:val="none" w:sz="0" w:space="0" w:color="000000"/>
+            </w:tcBorders>
+            <w:shd w:val="clear" w:color="auto" w:fill="FFFFFF"/>
+            <w:tcMar>
+              <w:top w:w="0" w:type="dxa"/>
+              <w:bottom w:w="0" w:type="dxa"/>
+              <w:left w:w="0" w:type="dxa"/>
+              <w:right w:w="0" w:type="dxa"/>
+            </w:tcMar>
+            <w:vAlign w:val="center"/>
+          </w:tcPr>
+          <w:p>
+            <w:pPr>
+              <w:pStyle w:val="Normal"/>
+              <w:jc w:val="center"/>
+              <w:pBdr>
+                <w:bottom w:val="none" w:sz="0" w:space="0" w:color="000000"/>
+                <w:top w:val="none" w:sz="0" w:space="0" w:color="000000"/>
+                <w:left w:val="none" w:sz="0" w:space="0" w:color="000000"/>
+                <w:right w:val="none" w:sz="0" w:space="0" w:color="000000"/>
+              </w:pBdr>
+              <w:spacing w:after="40" w:before="40" w:line="240"/>
+              <w:ind w:left="40" w:right="40" w:firstLine="0" w:firstLineChars="0"/>
+            </w:pPr>
+            <w:r>
+              <w:rPr>
+                <w:rFonts w:ascii="Helvetica" w:hAnsi="Helvetica" w:eastAsia="Helvetica" w:cs="Helvetica"/>
+                <w:i w:val="false"/>
+                <w:b w:val="false"/>
+                <w:u w:val="none"/>
+                <w:sz w:val="18"/>
+                <w:szCs w:val="18"/>
+                <w:color w:val="000000"/>
+              </w:rPr>
+              <w:t xml:space="preserve">*</w:t>
             </w:r>
           </w:p>
         </w:tc>
@@ -2510,227 +2510,227 @@
                 <w:szCs w:val="18"/>
                 <w:color w:val="000000"/>
               </w:rPr>
-              <w:t xml:space="preserve">logICP - logMT</w:t>
-            </w:r>
-          </w:p>
-        </w:tc>
-        <w:tc>
-          <w:tcPr>
-            <w:tcBorders>
-              <w:bottom w:val="none" w:sz="0" w:space="0" w:color="000000"/>
-              <w:top w:val="none" w:sz="0" w:space="0" w:color="000000"/>
-              <w:left w:val="none" w:sz="0" w:space="0" w:color="000000"/>
-              <w:right w:val="none" w:sz="0" w:space="0" w:color="000000"/>
-            </w:tcBorders>
-            <w:shd w:val="clear" w:color="auto" w:fill="FFFFFF"/>
-            <w:tcMar>
-              <w:top w:w="0" w:type="dxa"/>
-              <w:bottom w:w="0" w:type="dxa"/>
-              <w:left w:w="0" w:type="dxa"/>
-              <w:right w:w="0" w:type="dxa"/>
-            </w:tcMar>
-            <w:vAlign w:val="center"/>
-          </w:tcPr>
-          <w:p>
-            <w:pPr>
-              <w:pStyle w:val="Normal"/>
-              <w:jc w:val="center"/>
-              <w:pBdr>
-                <w:bottom w:val="none" w:sz="0" w:space="0" w:color="000000"/>
-                <w:top w:val="none" w:sz="0" w:space="0" w:color="000000"/>
-                <w:left w:val="none" w:sz="0" w:space="0" w:color="000000"/>
-                <w:right w:val="none" w:sz="0" w:space="0" w:color="000000"/>
-              </w:pBdr>
-              <w:spacing w:after="40" w:before="40" w:line="240"/>
-              <w:ind w:left="40" w:right="40" w:firstLine="0" w:firstLineChars="0"/>
-            </w:pPr>
-            <w:r>
-              <w:rPr>
-                <w:rFonts w:ascii="Helvetica" w:hAnsi="Helvetica" w:eastAsia="Helvetica" w:cs="Helvetica"/>
-                <w:i w:val="false"/>
-                <w:b w:val="false"/>
-                <w:u w:val="none"/>
-                <w:sz w:val="18"/>
-                <w:szCs w:val="18"/>
-                <w:color w:val="000000"/>
-              </w:rPr>
-              <w:t xml:space="preserve">-1.15</w:t>
-            </w:r>
-          </w:p>
-        </w:tc>
-        <w:tc>
-          <w:tcPr>
-            <w:tcBorders>
-              <w:bottom w:val="none" w:sz="0" w:space="0" w:color="000000"/>
-              <w:top w:val="none" w:sz="0" w:space="0" w:color="000000"/>
-              <w:left w:val="none" w:sz="0" w:space="0" w:color="000000"/>
-              <w:right w:val="none" w:sz="0" w:space="0" w:color="000000"/>
-            </w:tcBorders>
-            <w:shd w:val="clear" w:color="auto" w:fill="FFFFFF"/>
-            <w:tcMar>
-              <w:top w:w="0" w:type="dxa"/>
-              <w:bottom w:w="0" w:type="dxa"/>
-              <w:left w:w="0" w:type="dxa"/>
-              <w:right w:w="0" w:type="dxa"/>
-            </w:tcMar>
-            <w:vAlign w:val="center"/>
-          </w:tcPr>
-          <w:p>
-            <w:pPr>
-              <w:pStyle w:val="Normal"/>
-              <w:jc w:val="center"/>
-              <w:pBdr>
-                <w:bottom w:val="none" w:sz="0" w:space="0" w:color="000000"/>
-                <w:top w:val="none" w:sz="0" w:space="0" w:color="000000"/>
-                <w:left w:val="none" w:sz="0" w:space="0" w:color="000000"/>
-                <w:right w:val="none" w:sz="0" w:space="0" w:color="000000"/>
-              </w:pBdr>
-              <w:spacing w:after="40" w:before="40" w:line="240"/>
-              <w:ind w:left="40" w:right="40" w:firstLine="0" w:firstLineChars="0"/>
-            </w:pPr>
-            <w:r>
-              <w:rPr>
-                <w:rFonts w:ascii="Helvetica" w:hAnsi="Helvetica" w:eastAsia="Helvetica" w:cs="Helvetica"/>
-                <w:i w:val="false"/>
-                <w:b w:val="false"/>
-                <w:u w:val="none"/>
-                <w:sz w:val="18"/>
-                <w:szCs w:val="18"/>
-                <w:color w:val="000000"/>
-              </w:rPr>
-              <w:t xml:space="preserve">0.2521422901702</w:t>
-            </w:r>
-          </w:p>
-        </w:tc>
-        <w:tc>
-          <w:tcPr>
-            <w:tcBorders>
-              <w:bottom w:val="none" w:sz="0" w:space="0" w:color="000000"/>
-              <w:top w:val="none" w:sz="0" w:space="0" w:color="000000"/>
-              <w:left w:val="none" w:sz="0" w:space="0" w:color="000000"/>
-              <w:right w:val="none" w:sz="0" w:space="0" w:color="000000"/>
-            </w:tcBorders>
-            <w:shd w:val="clear" w:color="auto" w:fill="FFFFFF"/>
-            <w:tcMar>
-              <w:top w:w="0" w:type="dxa"/>
-              <w:bottom w:w="0" w:type="dxa"/>
-              <w:left w:w="0" w:type="dxa"/>
-              <w:right w:w="0" w:type="dxa"/>
-            </w:tcMar>
-            <w:vAlign w:val="center"/>
-          </w:tcPr>
-          <w:p>
-            <w:pPr>
-              <w:pStyle w:val="Normal"/>
-              <w:jc w:val="center"/>
-              <w:pBdr>
-                <w:bottom w:val="none" w:sz="0" w:space="0" w:color="000000"/>
-                <w:top w:val="none" w:sz="0" w:space="0" w:color="000000"/>
-                <w:left w:val="none" w:sz="0" w:space="0" w:color="000000"/>
-                <w:right w:val="none" w:sz="0" w:space="0" w:color="000000"/>
-              </w:pBdr>
-              <w:spacing w:after="40" w:before="40" w:line="240"/>
-              <w:ind w:left="40" w:right="40" w:firstLine="0" w:firstLineChars="0"/>
-            </w:pPr>
-            <w:r>
-              <w:rPr>
-                <w:rFonts w:ascii="Helvetica" w:hAnsi="Helvetica" w:eastAsia="Helvetica" w:cs="Helvetica"/>
-                <w:i w:val="false"/>
-                <w:b w:val="false"/>
-                <w:u w:val="none"/>
-                <w:sz w:val="18"/>
-                <w:szCs w:val="18"/>
-                <w:color w:val="000000"/>
-              </w:rPr>
-              <w:t xml:space="preserve">1.0000</w:t>
-            </w:r>
-          </w:p>
-        </w:tc>
-        <w:tc>
-          <w:tcPr>
-            <w:tcBorders>
-              <w:bottom w:val="none" w:sz="0" w:space="0" w:color="000000"/>
-              <w:top w:val="none" w:sz="0" w:space="0" w:color="000000"/>
-              <w:left w:val="none" w:sz="0" w:space="0" w:color="000000"/>
-              <w:right w:val="none" w:sz="0" w:space="0" w:color="000000"/>
-            </w:tcBorders>
-            <w:shd w:val="clear" w:color="auto" w:fill="FFFFFF"/>
-            <w:tcMar>
-              <w:top w:w="0" w:type="dxa"/>
-              <w:bottom w:w="0" w:type="dxa"/>
-              <w:left w:w="0" w:type="dxa"/>
-              <w:right w:w="0" w:type="dxa"/>
-            </w:tcMar>
-            <w:vAlign w:val="center"/>
-          </w:tcPr>
-          <w:p>
-            <w:pPr>
-              <w:pStyle w:val="Normal"/>
-              <w:jc w:val="center"/>
-              <w:pBdr>
-                <w:bottom w:val="none" w:sz="0" w:space="0" w:color="000000"/>
-                <w:top w:val="none" w:sz="0" w:space="0" w:color="000000"/>
-                <w:left w:val="none" w:sz="0" w:space="0" w:color="000000"/>
-                <w:right w:val="none" w:sz="0" w:space="0" w:color="000000"/>
-              </w:pBdr>
-              <w:spacing w:after="40" w:before="40" w:line="240"/>
-              <w:ind w:left="40" w:right="40" w:firstLine="0" w:firstLineChars="0"/>
-            </w:pPr>
-            <w:r>
-              <w:rPr>
-                <w:rFonts w:ascii="Helvetica" w:hAnsi="Helvetica" w:eastAsia="Helvetica" w:cs="Helvetica"/>
-                <w:i w:val="false"/>
-                <w:b w:val="false"/>
-                <w:u w:val="none"/>
-                <w:sz w:val="18"/>
-                <w:szCs w:val="18"/>
-                <w:color w:val="000000"/>
-              </w:rPr>
-              <w:t xml:space="preserve">Methods equivalent</w:t>
-            </w:r>
-          </w:p>
-        </w:tc>
-        <w:tc>
-          <w:tcPr>
-            <w:tcBorders>
-              <w:bottom w:val="none" w:sz="0" w:space="0" w:color="000000"/>
-              <w:top w:val="none" w:sz="0" w:space="0" w:color="000000"/>
-              <w:left w:val="none" w:sz="0" w:space="0" w:color="000000"/>
-              <w:right w:val="none" w:sz="0" w:space="0" w:color="000000"/>
-            </w:tcBorders>
-            <w:shd w:val="clear" w:color="auto" w:fill="FFFFFF"/>
-            <w:tcMar>
-              <w:top w:w="0" w:type="dxa"/>
-              <w:bottom w:w="0" w:type="dxa"/>
-              <w:left w:w="0" w:type="dxa"/>
-              <w:right w:w="0" w:type="dxa"/>
-            </w:tcMar>
-            <w:vAlign w:val="center"/>
-          </w:tcPr>
-          <w:p>
-            <w:pPr>
-              <w:pStyle w:val="Normal"/>
-              <w:jc w:val="center"/>
-              <w:pBdr>
-                <w:bottom w:val="none" w:sz="0" w:space="0" w:color="000000"/>
-                <w:top w:val="none" w:sz="0" w:space="0" w:color="000000"/>
-                <w:left w:val="none" w:sz="0" w:space="0" w:color="000000"/>
-                <w:right w:val="none" w:sz="0" w:space="0" w:color="000000"/>
-              </w:pBdr>
-              <w:spacing w:after="40" w:before="40" w:line="240"/>
-              <w:ind w:left="40" w:right="40" w:firstLine="0" w:firstLineChars="0"/>
-            </w:pPr>
-            <w:r>
-              <w:rPr>
-                <w:rFonts w:ascii="Helvetica" w:hAnsi="Helvetica" w:eastAsia="Helvetica" w:cs="Helvetica"/>
-                <w:i w:val="false"/>
-                <w:b w:val="false"/>
-                <w:u w:val="none"/>
-                <w:sz w:val="18"/>
-                <w:szCs w:val="18"/>
-                <w:color w:val="000000"/>
-              </w:rPr>
-              <w:t xml:space="preserve">NS</w:t>
+              <w:t xml:space="preserve">logPT</w:t>
+            </w:r>
+          </w:p>
+        </w:tc>
+        <w:tc>
+          <w:tcPr>
+            <w:tcBorders>
+              <w:bottom w:val="none" w:sz="0" w:space="0" w:color="000000"/>
+              <w:top w:val="none" w:sz="0" w:space="0" w:color="000000"/>
+              <w:left w:val="none" w:sz="0" w:space="0" w:color="000000"/>
+              <w:right w:val="none" w:sz="0" w:space="0" w:color="000000"/>
+            </w:tcBorders>
+            <w:shd w:val="clear" w:color="auto" w:fill="FFFFFF"/>
+            <w:tcMar>
+              <w:top w:w="0" w:type="dxa"/>
+              <w:bottom w:w="0" w:type="dxa"/>
+              <w:left w:w="0" w:type="dxa"/>
+              <w:right w:w="0" w:type="dxa"/>
+            </w:tcMar>
+            <w:vAlign w:val="center"/>
+          </w:tcPr>
+          <w:p>
+            <w:pPr>
+              <w:pStyle w:val="Normal"/>
+              <w:jc w:val="center"/>
+              <w:pBdr>
+                <w:bottom w:val="none" w:sz="0" w:space="0" w:color="000000"/>
+                <w:top w:val="none" w:sz="0" w:space="0" w:color="000000"/>
+                <w:left w:val="none" w:sz="0" w:space="0" w:color="000000"/>
+                <w:right w:val="none" w:sz="0" w:space="0" w:color="000000"/>
+              </w:pBdr>
+              <w:spacing w:after="40" w:before="40" w:line="240"/>
+              <w:ind w:left="40" w:right="40" w:firstLine="0" w:firstLineChars="0"/>
+            </w:pPr>
+            <w:r>
+              <w:rPr>
+                <w:rFonts w:ascii="Helvetica" w:hAnsi="Helvetica" w:eastAsia="Helvetica" w:cs="Helvetica"/>
+                <w:i w:val="false"/>
+                <w:b w:val="false"/>
+                <w:u w:val="none"/>
+                <w:sz w:val="18"/>
+                <w:szCs w:val="18"/>
+                <w:color w:val="000000"/>
+              </w:rPr>
+              <w:t xml:space="preserve">logIC</w:t>
+            </w:r>
+          </w:p>
+        </w:tc>
+        <w:tc>
+          <w:tcPr>
+            <w:tcBorders>
+              <w:bottom w:val="none" w:sz="0" w:space="0" w:color="000000"/>
+              <w:top w:val="none" w:sz="0" w:space="0" w:color="000000"/>
+              <w:left w:val="none" w:sz="0" w:space="0" w:color="000000"/>
+              <w:right w:val="none" w:sz="0" w:space="0" w:color="000000"/>
+            </w:tcBorders>
+            <w:shd w:val="clear" w:color="auto" w:fill="FFFFFF"/>
+            <w:tcMar>
+              <w:top w:w="0" w:type="dxa"/>
+              <w:bottom w:w="0" w:type="dxa"/>
+              <w:left w:w="0" w:type="dxa"/>
+              <w:right w:w="0" w:type="dxa"/>
+            </w:tcMar>
+            <w:vAlign w:val="center"/>
+          </w:tcPr>
+          <w:p>
+            <w:pPr>
+              <w:pStyle w:val="Normal"/>
+              <w:jc w:val="center"/>
+              <w:pBdr>
+                <w:bottom w:val="none" w:sz="0" w:space="0" w:color="000000"/>
+                <w:top w:val="none" w:sz="0" w:space="0" w:color="000000"/>
+                <w:left w:val="none" w:sz="0" w:space="0" w:color="000000"/>
+                <w:right w:val="none" w:sz="0" w:space="0" w:color="000000"/>
+              </w:pBdr>
+              <w:spacing w:after="40" w:before="40" w:line="240"/>
+              <w:ind w:left="40" w:right="40" w:firstLine="0" w:firstLineChars="0"/>
+            </w:pPr>
+            <w:r>
+              <w:rPr>
+                <w:rFonts w:ascii="Helvetica" w:hAnsi="Helvetica" w:eastAsia="Helvetica" w:cs="Helvetica"/>
+                <w:i w:val="false"/>
+                <w:b w:val="false"/>
+                <w:u w:val="none"/>
+                <w:sz w:val="18"/>
+                <w:szCs w:val="18"/>
+                <w:color w:val="000000"/>
+              </w:rPr>
+              <w:t xml:space="preserve">0.0000</w:t>
+            </w:r>
+          </w:p>
+        </w:tc>
+        <w:tc>
+          <w:tcPr>
+            <w:tcBorders>
+              <w:bottom w:val="none" w:sz="0" w:space="0" w:color="000000"/>
+              <w:top w:val="none" w:sz="0" w:space="0" w:color="000000"/>
+              <w:left w:val="none" w:sz="0" w:space="0" w:color="000000"/>
+              <w:right w:val="none" w:sz="0" w:space="0" w:color="000000"/>
+            </w:tcBorders>
+            <w:shd w:val="clear" w:color="auto" w:fill="FFFFFF"/>
+            <w:tcMar>
+              <w:top w:w="0" w:type="dxa"/>
+              <w:bottom w:w="0" w:type="dxa"/>
+              <w:left w:w="0" w:type="dxa"/>
+              <w:right w:w="0" w:type="dxa"/>
+            </w:tcMar>
+            <w:vAlign w:val="center"/>
+          </w:tcPr>
+          <w:p>
+            <w:pPr>
+              <w:pStyle w:val="Normal"/>
+              <w:jc w:val="center"/>
+              <w:pBdr>
+                <w:bottom w:val="none" w:sz="0" w:space="0" w:color="000000"/>
+                <w:top w:val="none" w:sz="0" w:space="0" w:color="000000"/>
+                <w:left w:val="none" w:sz="0" w:space="0" w:color="000000"/>
+                <w:right w:val="none" w:sz="0" w:space="0" w:color="000000"/>
+              </w:pBdr>
+              <w:spacing w:after="40" w:before="40" w:line="240"/>
+              <w:ind w:left="40" w:right="40" w:firstLine="0" w:firstLineChars="0"/>
+            </w:pPr>
+            <w:r>
+              <w:rPr>
+                <w:rFonts w:ascii="Helvetica" w:hAnsi="Helvetica" w:eastAsia="Helvetica" w:cs="Helvetica"/>
+                <w:i w:val="false"/>
+                <w:b w:val="false"/>
+                <w:u w:val="none"/>
+                <w:sz w:val="18"/>
+                <w:szCs w:val="18"/>
+                <w:color w:val="000000"/>
+              </w:rPr>
+              <w:t xml:space="preserve">Log</w:t>
+            </w:r>
+          </w:p>
+        </w:tc>
+        <w:tc>
+          <w:tcPr>
+            <w:tcBorders>
+              <w:bottom w:val="none" w:sz="0" w:space="0" w:color="000000"/>
+              <w:top w:val="none" w:sz="0" w:space="0" w:color="000000"/>
+              <w:left w:val="none" w:sz="0" w:space="0" w:color="000000"/>
+              <w:right w:val="none" w:sz="0" w:space="0" w:color="000000"/>
+            </w:tcBorders>
+            <w:shd w:val="clear" w:color="auto" w:fill="FFFFFF"/>
+            <w:tcMar>
+              <w:top w:w="0" w:type="dxa"/>
+              <w:bottom w:w="0" w:type="dxa"/>
+              <w:left w:w="0" w:type="dxa"/>
+              <w:right w:w="0" w:type="dxa"/>
+            </w:tcMar>
+            <w:vAlign w:val="center"/>
+          </w:tcPr>
+          <w:p>
+            <w:pPr>
+              <w:pStyle w:val="Normal"/>
+              <w:jc w:val="center"/>
+              <w:pBdr>
+                <w:bottom w:val="none" w:sz="0" w:space="0" w:color="000000"/>
+                <w:top w:val="none" w:sz="0" w:space="0" w:color="000000"/>
+                <w:left w:val="none" w:sz="0" w:space="0" w:color="000000"/>
+                <w:right w:val="none" w:sz="0" w:space="0" w:color="000000"/>
+              </w:pBdr>
+              <w:spacing w:after="40" w:before="40" w:line="240"/>
+              <w:ind w:left="40" w:right="40" w:firstLine="0" w:firstLineChars="0"/>
+            </w:pPr>
+            <w:r>
+              <w:rPr>
+                <w:rFonts w:ascii="Helvetica" w:hAnsi="Helvetica" w:eastAsia="Helvetica" w:cs="Helvetica"/>
+                <w:i w:val="false"/>
+                <w:b w:val="false"/>
+                <w:u w:val="none"/>
+                <w:sz w:val="18"/>
+                <w:szCs w:val="18"/>
+                <w:color w:val="000000"/>
+              </w:rPr>
+              <w:t xml:space="preserve">Signif. different</w:t>
+            </w:r>
+          </w:p>
+        </w:tc>
+        <w:tc>
+          <w:tcPr>
+            <w:tcBorders>
+              <w:bottom w:val="none" w:sz="0" w:space="0" w:color="000000"/>
+              <w:top w:val="none" w:sz="0" w:space="0" w:color="000000"/>
+              <w:left w:val="none" w:sz="0" w:space="0" w:color="000000"/>
+              <w:right w:val="none" w:sz="0" w:space="0" w:color="000000"/>
+            </w:tcBorders>
+            <w:shd w:val="clear" w:color="auto" w:fill="FFFFFF"/>
+            <w:tcMar>
+              <w:top w:w="0" w:type="dxa"/>
+              <w:bottom w:w="0" w:type="dxa"/>
+              <w:left w:w="0" w:type="dxa"/>
+              <w:right w:w="0" w:type="dxa"/>
+            </w:tcMar>
+            <w:vAlign w:val="center"/>
+          </w:tcPr>
+          <w:p>
+            <w:pPr>
+              <w:pStyle w:val="Normal"/>
+              <w:jc w:val="center"/>
+              <w:pBdr>
+                <w:bottom w:val="none" w:sz="0" w:space="0" w:color="000000"/>
+                <w:top w:val="none" w:sz="0" w:space="0" w:color="000000"/>
+                <w:left w:val="none" w:sz="0" w:space="0" w:color="000000"/>
+                <w:right w:val="none" w:sz="0" w:space="0" w:color="000000"/>
+              </w:pBdr>
+              <w:spacing w:after="40" w:before="40" w:line="240"/>
+              <w:ind w:left="40" w:right="40" w:firstLine="0" w:firstLineChars="0"/>
+            </w:pPr>
+            <w:r>
+              <w:rPr>
+                <w:rFonts w:ascii="Helvetica" w:hAnsi="Helvetica" w:eastAsia="Helvetica" w:cs="Helvetica"/>
+                <w:i w:val="false"/>
+                <w:b w:val="false"/>
+                <w:u w:val="none"/>
+                <w:sz w:val="18"/>
+                <w:szCs w:val="18"/>
+                <w:color w:val="000000"/>
+              </w:rPr>
+              <w:t xml:space="preserve">***</w:t>
             </w:r>
           </w:p>
         </w:tc>
@@ -2780,139 +2780,139 @@
                 <w:szCs w:val="18"/>
                 <w:color w:val="000000"/>
               </w:rPr>
-              <w:t xml:space="preserve">logIC - logPT</w:t>
-            </w:r>
-          </w:p>
-        </w:tc>
-        <w:tc>
-          <w:tcPr>
-            <w:tcBorders>
-              <w:bottom w:val="none" w:sz="0" w:space="0" w:color="000000"/>
-              <w:top w:val="none" w:sz="0" w:space="0" w:color="000000"/>
-              <w:left w:val="none" w:sz="0" w:space="0" w:color="000000"/>
-              <w:right w:val="none" w:sz="0" w:space="0" w:color="000000"/>
-            </w:tcBorders>
-            <w:shd w:val="clear" w:color="auto" w:fill="FFFFFF"/>
-            <w:tcMar>
-              <w:top w:w="0" w:type="dxa"/>
-              <w:bottom w:w="0" w:type="dxa"/>
-              <w:left w:w="0" w:type="dxa"/>
-              <w:right w:w="0" w:type="dxa"/>
-            </w:tcMar>
-            <w:vAlign w:val="center"/>
-          </w:tcPr>
-          <w:p>
-            <w:pPr>
-              <w:pStyle w:val="Normal"/>
-              <w:jc w:val="center"/>
-              <w:pBdr>
-                <w:bottom w:val="none" w:sz="0" w:space="0" w:color="000000"/>
-                <w:top w:val="none" w:sz="0" w:space="0" w:color="000000"/>
-                <w:left w:val="none" w:sz="0" w:space="0" w:color="000000"/>
-                <w:right w:val="none" w:sz="0" w:space="0" w:color="000000"/>
-              </w:pBdr>
-              <w:spacing w:after="40" w:before="40" w:line="240"/>
-              <w:ind w:left="40" w:right="40" w:firstLine="0" w:firstLineChars="0"/>
-            </w:pPr>
-            <w:r>
-              <w:rPr>
-                <w:rFonts w:ascii="Helvetica" w:hAnsi="Helvetica" w:eastAsia="Helvetica" w:cs="Helvetica"/>
-                <w:i w:val="false"/>
-                <w:b w:val="false"/>
-                <w:u w:val="none"/>
-                <w:sz w:val="18"/>
-                <w:szCs w:val="18"/>
-                <w:color w:val="000000"/>
-              </w:rPr>
-              <w:t xml:space="preserve">-4.58</w:t>
-            </w:r>
-          </w:p>
-        </w:tc>
-        <w:tc>
-          <w:tcPr>
-            <w:tcBorders>
-              <w:bottom w:val="none" w:sz="0" w:space="0" w:color="000000"/>
-              <w:top w:val="none" w:sz="0" w:space="0" w:color="000000"/>
-              <w:left w:val="none" w:sz="0" w:space="0" w:color="000000"/>
-              <w:right w:val="none" w:sz="0" w:space="0" w:color="000000"/>
-            </w:tcBorders>
-            <w:shd w:val="clear" w:color="auto" w:fill="FFFFFF"/>
-            <w:tcMar>
-              <w:top w:w="0" w:type="dxa"/>
-              <w:bottom w:w="0" w:type="dxa"/>
-              <w:left w:w="0" w:type="dxa"/>
-              <w:right w:w="0" w:type="dxa"/>
-            </w:tcMar>
-            <w:vAlign w:val="center"/>
-          </w:tcPr>
-          <w:p>
-            <w:pPr>
-              <w:pStyle w:val="Normal"/>
-              <w:jc w:val="center"/>
-              <w:pBdr>
-                <w:bottom w:val="none" w:sz="0" w:space="0" w:color="000000"/>
-                <w:top w:val="none" w:sz="0" w:space="0" w:color="000000"/>
-                <w:left w:val="none" w:sz="0" w:space="0" w:color="000000"/>
-                <w:right w:val="none" w:sz="0" w:space="0" w:color="000000"/>
-              </w:pBdr>
-              <w:spacing w:after="40" w:before="40" w:line="240"/>
-              <w:ind w:left="40" w:right="40" w:firstLine="0" w:firstLineChars="0"/>
-            </w:pPr>
-            <w:r>
-              <w:rPr>
-                <w:rFonts w:ascii="Helvetica" w:hAnsi="Helvetica" w:eastAsia="Helvetica" w:cs="Helvetica"/>
-                <w:i w:val="false"/>
-                <w:b w:val="false"/>
-                <w:u w:val="none"/>
-                <w:sz w:val="18"/>
-                <w:szCs w:val="18"/>
-                <w:color w:val="000000"/>
-              </w:rPr>
-              <w:t xml:space="preserve">0.0000046869077</w:t>
-            </w:r>
-          </w:p>
-        </w:tc>
-        <w:tc>
-          <w:tcPr>
-            <w:tcBorders>
-              <w:bottom w:val="none" w:sz="0" w:space="0" w:color="000000"/>
-              <w:top w:val="none" w:sz="0" w:space="0" w:color="000000"/>
-              <w:left w:val="none" w:sz="0" w:space="0" w:color="000000"/>
-              <w:right w:val="none" w:sz="0" w:space="0" w:color="000000"/>
-            </w:tcBorders>
-            <w:shd w:val="clear" w:color="auto" w:fill="FFFFFF"/>
-            <w:tcMar>
-              <w:top w:w="0" w:type="dxa"/>
-              <w:bottom w:w="0" w:type="dxa"/>
-              <w:left w:w="0" w:type="dxa"/>
-              <w:right w:w="0" w:type="dxa"/>
-            </w:tcMar>
-            <w:vAlign w:val="center"/>
-          </w:tcPr>
-          <w:p>
-            <w:pPr>
-              <w:pStyle w:val="Normal"/>
-              <w:jc w:val="center"/>
-              <w:pBdr>
-                <w:bottom w:val="none" w:sz="0" w:space="0" w:color="000000"/>
-                <w:top w:val="none" w:sz="0" w:space="0" w:color="000000"/>
-                <w:left w:val="none" w:sz="0" w:space="0" w:color="000000"/>
-                <w:right w:val="none" w:sz="0" w:space="0" w:color="000000"/>
-              </w:pBdr>
-              <w:spacing w:after="40" w:before="40" w:line="240"/>
-              <w:ind w:left="40" w:right="40" w:firstLine="0" w:firstLineChars="0"/>
-            </w:pPr>
-            <w:r>
-              <w:rPr>
-                <w:rFonts w:ascii="Helvetica" w:hAnsi="Helvetica" w:eastAsia="Helvetica" w:cs="Helvetica"/>
-                <w:i w:val="false"/>
-                <w:b w:val="false"/>
-                <w:u w:val="none"/>
-                <w:sz w:val="18"/>
-                <w:szCs w:val="18"/>
-                <w:color w:val="000000"/>
-              </w:rPr>
-              <w:t xml:space="preserve">0.0000</w:t>
+              <w:t xml:space="preserve">logMT</w:t>
+            </w:r>
+          </w:p>
+        </w:tc>
+        <w:tc>
+          <w:tcPr>
+            <w:tcBorders>
+              <w:bottom w:val="none" w:sz="0" w:space="0" w:color="000000"/>
+              <w:top w:val="none" w:sz="0" w:space="0" w:color="000000"/>
+              <w:left w:val="none" w:sz="0" w:space="0" w:color="000000"/>
+              <w:right w:val="none" w:sz="0" w:space="0" w:color="000000"/>
+            </w:tcBorders>
+            <w:shd w:val="clear" w:color="auto" w:fill="FFFFFF"/>
+            <w:tcMar>
+              <w:top w:w="0" w:type="dxa"/>
+              <w:bottom w:w="0" w:type="dxa"/>
+              <w:left w:w="0" w:type="dxa"/>
+              <w:right w:w="0" w:type="dxa"/>
+            </w:tcMar>
+            <w:vAlign w:val="center"/>
+          </w:tcPr>
+          <w:p>
+            <w:pPr>
+              <w:pStyle w:val="Normal"/>
+              <w:jc w:val="center"/>
+              <w:pBdr>
+                <w:bottom w:val="none" w:sz="0" w:space="0" w:color="000000"/>
+                <w:top w:val="none" w:sz="0" w:space="0" w:color="000000"/>
+                <w:left w:val="none" w:sz="0" w:space="0" w:color="000000"/>
+                <w:right w:val="none" w:sz="0" w:space="0" w:color="000000"/>
+              </w:pBdr>
+              <w:spacing w:after="40" w:before="40" w:line="240"/>
+              <w:ind w:left="40" w:right="40" w:firstLine="0" w:firstLineChars="0"/>
+            </w:pPr>
+            <w:r>
+              <w:rPr>
+                <w:rFonts w:ascii="Helvetica" w:hAnsi="Helvetica" w:eastAsia="Helvetica" w:cs="Helvetica"/>
+                <w:i w:val="false"/>
+                <w:b w:val="false"/>
+                <w:u w:val="none"/>
+                <w:sz w:val="18"/>
+                <w:szCs w:val="18"/>
+                <w:color w:val="000000"/>
+              </w:rPr>
+              <w:t xml:space="preserve">logICP</w:t>
+            </w:r>
+          </w:p>
+        </w:tc>
+        <w:tc>
+          <w:tcPr>
+            <w:tcBorders>
+              <w:bottom w:val="none" w:sz="0" w:space="0" w:color="000000"/>
+              <w:top w:val="none" w:sz="0" w:space="0" w:color="000000"/>
+              <w:left w:val="none" w:sz="0" w:space="0" w:color="000000"/>
+              <w:right w:val="none" w:sz="0" w:space="0" w:color="000000"/>
+            </w:tcBorders>
+            <w:shd w:val="clear" w:color="auto" w:fill="FFFFFF"/>
+            <w:tcMar>
+              <w:top w:w="0" w:type="dxa"/>
+              <w:bottom w:w="0" w:type="dxa"/>
+              <w:left w:w="0" w:type="dxa"/>
+              <w:right w:w="0" w:type="dxa"/>
+            </w:tcMar>
+            <w:vAlign w:val="center"/>
+          </w:tcPr>
+          <w:p>
+            <w:pPr>
+              <w:pStyle w:val="Normal"/>
+              <w:jc w:val="center"/>
+              <w:pBdr>
+                <w:bottom w:val="none" w:sz="0" w:space="0" w:color="000000"/>
+                <w:top w:val="none" w:sz="0" w:space="0" w:color="000000"/>
+                <w:left w:val="none" w:sz="0" w:space="0" w:color="000000"/>
+                <w:right w:val="none" w:sz="0" w:space="0" w:color="000000"/>
+              </w:pBdr>
+              <w:spacing w:after="40" w:before="40" w:line="240"/>
+              <w:ind w:left="40" w:right="40" w:firstLine="0" w:firstLineChars="0"/>
+            </w:pPr>
+            <w:r>
+              <w:rPr>
+                <w:rFonts w:ascii="Helvetica" w:hAnsi="Helvetica" w:eastAsia="Helvetica" w:cs="Helvetica"/>
+                <w:i w:val="false"/>
+                <w:b w:val="false"/>
+                <w:u w:val="none"/>
+                <w:sz w:val="18"/>
+                <w:szCs w:val="18"/>
+                <w:color w:val="000000"/>
+              </w:rPr>
+              <w:t xml:space="preserve">0.0021</w:t>
+            </w:r>
+          </w:p>
+        </w:tc>
+        <w:tc>
+          <w:tcPr>
+            <w:tcBorders>
+              <w:bottom w:val="none" w:sz="0" w:space="0" w:color="000000"/>
+              <w:top w:val="none" w:sz="0" w:space="0" w:color="000000"/>
+              <w:left w:val="none" w:sz="0" w:space="0" w:color="000000"/>
+              <w:right w:val="none" w:sz="0" w:space="0" w:color="000000"/>
+            </w:tcBorders>
+            <w:shd w:val="clear" w:color="auto" w:fill="FFFFFF"/>
+            <w:tcMar>
+              <w:top w:w="0" w:type="dxa"/>
+              <w:bottom w:w="0" w:type="dxa"/>
+              <w:left w:w="0" w:type="dxa"/>
+              <w:right w:w="0" w:type="dxa"/>
+            </w:tcMar>
+            <w:vAlign w:val="center"/>
+          </w:tcPr>
+          <w:p>
+            <w:pPr>
+              <w:pStyle w:val="Normal"/>
+              <w:jc w:val="center"/>
+              <w:pBdr>
+                <w:bottom w:val="none" w:sz="0" w:space="0" w:color="000000"/>
+                <w:top w:val="none" w:sz="0" w:space="0" w:color="000000"/>
+                <w:left w:val="none" w:sz="0" w:space="0" w:color="000000"/>
+                <w:right w:val="none" w:sz="0" w:space="0" w:color="000000"/>
+              </w:pBdr>
+              <w:spacing w:after="40" w:before="40" w:line="240"/>
+              <w:ind w:left="40" w:right="40" w:firstLine="0" w:firstLineChars="0"/>
+            </w:pPr>
+            <w:r>
+              <w:rPr>
+                <w:rFonts w:ascii="Helvetica" w:hAnsi="Helvetica" w:eastAsia="Helvetica" w:cs="Helvetica"/>
+                <w:i w:val="false"/>
+                <w:b w:val="false"/>
+                <w:u w:val="none"/>
+                <w:sz w:val="18"/>
+                <w:szCs w:val="18"/>
+                <w:color w:val="000000"/>
+              </w:rPr>
+              <w:t xml:space="preserve">Log</w:t>
             </w:r>
           </w:p>
         </w:tc>
@@ -3000,7 +3000,7 @@
                 <w:szCs w:val="18"/>
                 <w:color w:val="000000"/>
               </w:rPr>
-              <w:t xml:space="preserve">***</w:t>
+              <w:t xml:space="preserve">**</w:t>
             </w:r>
           </w:p>
         </w:tc>
@@ -3050,95 +3050,51 @@
                 <w:szCs w:val="18"/>
                 <w:color w:val="000000"/>
               </w:rPr>
-              <w:t xml:space="preserve">logICP - logPT</w:t>
-            </w:r>
-          </w:p>
-        </w:tc>
-        <w:tc>
-          <w:tcPr>
-            <w:tcBorders>
-              <w:bottom w:val="none" w:sz="0" w:space="0" w:color="000000"/>
-              <w:top w:val="none" w:sz="0" w:space="0" w:color="000000"/>
-              <w:left w:val="none" w:sz="0" w:space="0" w:color="000000"/>
-              <w:right w:val="none" w:sz="0" w:space="0" w:color="000000"/>
-            </w:tcBorders>
-            <w:shd w:val="clear" w:color="auto" w:fill="FFFFFF"/>
-            <w:tcMar>
-              <w:top w:w="0" w:type="dxa"/>
-              <w:bottom w:w="0" w:type="dxa"/>
-              <w:left w:w="0" w:type="dxa"/>
-              <w:right w:w="0" w:type="dxa"/>
-            </w:tcMar>
-            <w:vAlign w:val="center"/>
-          </w:tcPr>
-          <w:p>
-            <w:pPr>
-              <w:pStyle w:val="Normal"/>
-              <w:jc w:val="center"/>
-              <w:pBdr>
-                <w:bottom w:val="none" w:sz="0" w:space="0" w:color="000000"/>
-                <w:top w:val="none" w:sz="0" w:space="0" w:color="000000"/>
-                <w:left w:val="none" w:sz="0" w:space="0" w:color="000000"/>
-                <w:right w:val="none" w:sz="0" w:space="0" w:color="000000"/>
-              </w:pBdr>
-              <w:spacing w:after="40" w:before="40" w:line="240"/>
-              <w:ind w:left="40" w:right="40" w:firstLine="0" w:firstLineChars="0"/>
-            </w:pPr>
-            <w:r>
-              <w:rPr>
-                <w:rFonts w:ascii="Helvetica" w:hAnsi="Helvetica" w:eastAsia="Helvetica" w:cs="Helvetica"/>
-                <w:i w:val="false"/>
-                <w:b w:val="false"/>
-                <w:u w:val="none"/>
-                <w:sz w:val="18"/>
-                <w:szCs w:val="18"/>
-                <w:color w:val="000000"/>
-              </w:rPr>
-              <w:t xml:space="preserve">-4.87</w:t>
-            </w:r>
-          </w:p>
-        </w:tc>
-        <w:tc>
-          <w:tcPr>
-            <w:tcBorders>
-              <w:bottom w:val="none" w:sz="0" w:space="0" w:color="000000"/>
-              <w:top w:val="none" w:sz="0" w:space="0" w:color="000000"/>
-              <w:left w:val="none" w:sz="0" w:space="0" w:color="000000"/>
-              <w:right w:val="none" w:sz="0" w:space="0" w:color="000000"/>
-            </w:tcBorders>
-            <w:shd w:val="clear" w:color="auto" w:fill="FFFFFF"/>
-            <w:tcMar>
-              <w:top w:w="0" w:type="dxa"/>
-              <w:bottom w:w="0" w:type="dxa"/>
-              <w:left w:w="0" w:type="dxa"/>
-              <w:right w:w="0" w:type="dxa"/>
-            </w:tcMar>
-            <w:vAlign w:val="center"/>
-          </w:tcPr>
-          <w:p>
-            <w:pPr>
-              <w:pStyle w:val="Normal"/>
-              <w:jc w:val="center"/>
-              <w:pBdr>
-                <w:bottom w:val="none" w:sz="0" w:space="0" w:color="000000"/>
-                <w:top w:val="none" w:sz="0" w:space="0" w:color="000000"/>
-                <w:left w:val="none" w:sz="0" w:space="0" w:color="000000"/>
-                <w:right w:val="none" w:sz="0" w:space="0" w:color="000000"/>
-              </w:pBdr>
-              <w:spacing w:after="40" w:before="40" w:line="240"/>
-              <w:ind w:left="40" w:right="40" w:firstLine="0" w:firstLineChars="0"/>
-            </w:pPr>
-            <w:r>
-              <w:rPr>
-                <w:rFonts w:ascii="Helvetica" w:hAnsi="Helvetica" w:eastAsia="Helvetica" w:cs="Helvetica"/>
-                <w:i w:val="false"/>
-                <w:b w:val="false"/>
-                <w:u w:val="none"/>
-                <w:sz w:val="18"/>
-                <w:szCs w:val="18"/>
-                <w:color w:val="000000"/>
-              </w:rPr>
-              <w:t xml:space="preserve">0.0000011104653</w:t>
+              <w:t xml:space="preserve">logPT</w:t>
+            </w:r>
+          </w:p>
+        </w:tc>
+        <w:tc>
+          <w:tcPr>
+            <w:tcBorders>
+              <w:bottom w:val="none" w:sz="0" w:space="0" w:color="000000"/>
+              <w:top w:val="none" w:sz="0" w:space="0" w:color="000000"/>
+              <w:left w:val="none" w:sz="0" w:space="0" w:color="000000"/>
+              <w:right w:val="none" w:sz="0" w:space="0" w:color="000000"/>
+            </w:tcBorders>
+            <w:shd w:val="clear" w:color="auto" w:fill="FFFFFF"/>
+            <w:tcMar>
+              <w:top w:w="0" w:type="dxa"/>
+              <w:bottom w:w="0" w:type="dxa"/>
+              <w:left w:w="0" w:type="dxa"/>
+              <w:right w:w="0" w:type="dxa"/>
+            </w:tcMar>
+            <w:vAlign w:val="center"/>
+          </w:tcPr>
+          <w:p>
+            <w:pPr>
+              <w:pStyle w:val="Normal"/>
+              <w:jc w:val="center"/>
+              <w:pBdr>
+                <w:bottom w:val="none" w:sz="0" w:space="0" w:color="000000"/>
+                <w:top w:val="none" w:sz="0" w:space="0" w:color="000000"/>
+                <w:left w:val="none" w:sz="0" w:space="0" w:color="000000"/>
+                <w:right w:val="none" w:sz="0" w:space="0" w:color="000000"/>
+              </w:pBdr>
+              <w:spacing w:after="40" w:before="40" w:line="240"/>
+              <w:ind w:left="40" w:right="40" w:firstLine="0" w:firstLineChars="0"/>
+            </w:pPr>
+            <w:r>
+              <w:rPr>
+                <w:rFonts w:ascii="Helvetica" w:hAnsi="Helvetica" w:eastAsia="Helvetica" w:cs="Helvetica"/>
+                <w:i w:val="false"/>
+                <w:b w:val="false"/>
+                <w:u w:val="none"/>
+                <w:sz w:val="18"/>
+                <w:szCs w:val="18"/>
+                <w:color w:val="000000"/>
+              </w:rPr>
+              <w:t xml:space="preserve">logICP</w:t>
             </w:r>
           </w:p>
         </w:tc>
@@ -3183,6 +3139,50 @@
                 <w:color w:val="000000"/>
               </w:rPr>
               <w:t xml:space="preserve">0.0000</w:t>
+            </w:r>
+          </w:p>
+        </w:tc>
+        <w:tc>
+          <w:tcPr>
+            <w:tcBorders>
+              <w:bottom w:val="none" w:sz="0" w:space="0" w:color="000000"/>
+              <w:top w:val="none" w:sz="0" w:space="0" w:color="000000"/>
+              <w:left w:val="none" w:sz="0" w:space="0" w:color="000000"/>
+              <w:right w:val="none" w:sz="0" w:space="0" w:color="000000"/>
+            </w:tcBorders>
+            <w:shd w:val="clear" w:color="auto" w:fill="FFFFFF"/>
+            <w:tcMar>
+              <w:top w:w="0" w:type="dxa"/>
+              <w:bottom w:w="0" w:type="dxa"/>
+              <w:left w:w="0" w:type="dxa"/>
+              <w:right w:w="0" w:type="dxa"/>
+            </w:tcMar>
+            <w:vAlign w:val="center"/>
+          </w:tcPr>
+          <w:p>
+            <w:pPr>
+              <w:pStyle w:val="Normal"/>
+              <w:jc w:val="center"/>
+              <w:pBdr>
+                <w:bottom w:val="none" w:sz="0" w:space="0" w:color="000000"/>
+                <w:top w:val="none" w:sz="0" w:space="0" w:color="000000"/>
+                <w:left w:val="none" w:sz="0" w:space="0" w:color="000000"/>
+                <w:right w:val="none" w:sz="0" w:space="0" w:color="000000"/>
+              </w:pBdr>
+              <w:spacing w:after="40" w:before="40" w:line="240"/>
+              <w:ind w:left="40" w:right="40" w:firstLine="0" w:firstLineChars="0"/>
+            </w:pPr>
+            <w:r>
+              <w:rPr>
+                <w:rFonts w:ascii="Helvetica" w:hAnsi="Helvetica" w:eastAsia="Helvetica" w:cs="Helvetica"/>
+                <w:i w:val="false"/>
+                <w:b w:val="false"/>
+                <w:u w:val="none"/>
+                <w:sz w:val="18"/>
+                <w:szCs w:val="18"/>
+                <w:color w:val="000000"/>
+              </w:rPr>
+              <w:t xml:space="preserve">Log</w:t>
             </w:r>
           </w:p>
         </w:tc>
@@ -3320,7 +3320,7 @@
                 <w:szCs w:val="18"/>
                 <w:color w:val="000000"/>
               </w:rPr>
-              <w:t xml:space="preserve">logMT - logPT</w:t>
+              <w:t xml:space="preserve">logPT</w:t>
             </w:r>
           </w:p>
         </w:tc>
@@ -3364,7 +3364,7 @@
                 <w:szCs w:val="18"/>
                 <w:color w:val="000000"/>
               </w:rPr>
-              <w:t xml:space="preserve">-3.73</w:t>
+              <w:t xml:space="preserve">logMT</w:t>
             </w:r>
           </w:p>
         </w:tc>
@@ -3408,7 +3408,7 @@
                 <w:szCs w:val="18"/>
                 <w:color w:val="000000"/>
               </w:rPr>
-              <w:t xml:space="preserve">0.0001946830193</w:t>
+              <w:t xml:space="preserve">0.0000</w:t>
             </w:r>
           </w:p>
         </w:tc>
@@ -3452,7 +3452,7 @@
                 <w:szCs w:val="18"/>
                 <w:color w:val="000000"/>
               </w:rPr>
-              <w:t xml:space="preserve">0.0012</w:t>
+              <w:t xml:space="preserve">Log</w:t>
             </w:r>
           </w:p>
         </w:tc>
@@ -3540,7 +3540,7 @@
                 <w:szCs w:val="18"/>
                 <w:color w:val="000000"/>
               </w:rPr>
-              <w:t xml:space="preserve">**</w:t>
+              <w:t xml:space="preserve">***</w:t>
             </w:r>
           </w:p>
         </w:tc>

</xml_diff>